<commit_message>
kableExtra caused problems, removed
</commit_message>
<xml_diff>
--- a/springrun_threshold_comparison.docx
+++ b/springrun_threshold_comparison.docx
@@ -7,18 +7,9 @@
         <w:pStyle w:val="Heading1"/>
       </w:pPr>
       <w:r>
-        <w:t>Spring-Run Chinook Salmon Surrogate Thresholds</w:t>
+        <w:t>Spring-run Annual Loss Threshold Calculation Methods</w:t>
       </w:r>
     </w:p>
-    <w:p>
-      <w:pPr>
-        <w:pStyle w:val="Heading1"/>
-      </w:pPr>
-      <w:r>
-        <w:t>Annual Loss Threshold Calculation Methods</w:t>
-      </w:r>
-    </w:p>
-    <w:p/>
     <w:p>
       <w:pPr>
         <w:pStyle w:val="Heading2"/>
@@ -58,7 +49,6 @@
         <w:t>The JPE for each release group of salmonids entering the Delta shall be determined by the historical average survival from release sites to Delta entry, or when available, by observed survival to Delta entry provided by real-time acoustic receiver arrays. Reclamation and DWR, through Governance, may modify survival estimates based on year-specific conditions.</w:t>
       </w:r>
     </w:p>
-    <w:p/>
     <w:p>
       <w:pPr>
         <w:pStyle w:val="Heading2"/>
@@ -72,7 +62,6 @@
         <w:t>The Proposed Action requires tracking spring-run Chinook salmon loss using Coleman Late-Fall releases as yearling surrogates. The 1% loss threshold is calculated as 1% of the Juvenile Production Estimate (JPE) entering the Delta. JPE = Number Released × Survival Rate.</w:t>
       </w:r>
     </w:p>
-    <w:p/>
     <w:p>
       <w:pPr>
         <w:pStyle w:val="Heading2"/>
@@ -105,11 +94,11 @@
             <w:tcW w:w="1768" w:type="dxa"/>
             <w:tcBorders>
               <w:top w:val="single" w:sz="12" w:space="0" w:color="666666"/>
-              <w:left w:val="none" w:sz="0" w:space="0" w:color="000000"/>
+              <w:left w:val="none" w:sz="0" w:space="0" w:color="000000" w:themeColor="text1"/>
               <w:bottom w:val="single" w:sz="12" w:space="0" w:color="666666"/>
-              <w:right w:val="none" w:sz="0" w:space="0" w:color="000000"/>
-            </w:tcBorders>
-            <w:shd w:val="clear" w:color="auto" w:fill="FFFFFF"/>
+              <w:right w:val="none" w:sz="0" w:space="0" w:color="000000" w:themeColor="text1"/>
+            </w:tcBorders>
+            <w:shd w:val="clear" w:color="auto" w:fill="FFFFFF" w:themeFill="background1"/>
             <w:tcMar>
               <w:top w:w="0" w:type="dxa"/>
               <w:left w:w="0" w:type="dxa"/>
@@ -151,11 +140,11 @@
             <w:tcW w:w="2135" w:type="dxa"/>
             <w:tcBorders>
               <w:top w:val="single" w:sz="12" w:space="0" w:color="666666"/>
-              <w:left w:val="none" w:sz="0" w:space="0" w:color="000000"/>
+              <w:left w:val="none" w:sz="0" w:space="0" w:color="000000" w:themeColor="text1"/>
               <w:bottom w:val="single" w:sz="12" w:space="0" w:color="666666"/>
-              <w:right w:val="none" w:sz="0" w:space="0" w:color="000000"/>
-            </w:tcBorders>
-            <w:shd w:val="clear" w:color="auto" w:fill="FFFFFF"/>
+              <w:right w:val="none" w:sz="0" w:space="0" w:color="000000" w:themeColor="text1"/>
+            </w:tcBorders>
+            <w:shd w:val="clear" w:color="auto" w:fill="FFFFFF" w:themeFill="background1"/>
             <w:tcMar>
               <w:top w:w="0" w:type="dxa"/>
               <w:left w:w="0" w:type="dxa"/>
@@ -198,11 +187,11 @@
             <w:tcW w:w="1878" w:type="dxa"/>
             <w:tcBorders>
               <w:top w:val="single" w:sz="12" w:space="0" w:color="666666"/>
-              <w:left w:val="none" w:sz="0" w:space="0" w:color="000000"/>
+              <w:left w:val="none" w:sz="0" w:space="0" w:color="000000" w:themeColor="text1"/>
               <w:bottom w:val="single" w:sz="12" w:space="0" w:color="666666"/>
-              <w:right w:val="none" w:sz="0" w:space="0" w:color="000000"/>
-            </w:tcBorders>
-            <w:shd w:val="clear" w:color="auto" w:fill="FFFFFF"/>
+              <w:right w:val="none" w:sz="0" w:space="0" w:color="000000" w:themeColor="text1"/>
+            </w:tcBorders>
+            <w:shd w:val="clear" w:color="auto" w:fill="FFFFFF" w:themeFill="background1"/>
             <w:tcMar>
               <w:top w:w="0" w:type="dxa"/>
               <w:left w:w="0" w:type="dxa"/>
@@ -245,11 +234,11 @@
             <w:tcW w:w="1890" w:type="dxa"/>
             <w:tcBorders>
               <w:top w:val="single" w:sz="12" w:space="0" w:color="666666"/>
-              <w:left w:val="none" w:sz="0" w:space="0" w:color="000000"/>
+              <w:left w:val="none" w:sz="0" w:space="0" w:color="000000" w:themeColor="text1"/>
               <w:bottom w:val="single" w:sz="12" w:space="0" w:color="666666"/>
-              <w:right w:val="none" w:sz="0" w:space="0" w:color="000000"/>
-            </w:tcBorders>
-            <w:shd w:val="clear" w:color="auto" w:fill="FFFFFF"/>
+              <w:right w:val="none" w:sz="0" w:space="0" w:color="000000" w:themeColor="text1"/>
+            </w:tcBorders>
+            <w:shd w:val="clear" w:color="auto" w:fill="FFFFFF" w:themeFill="background1"/>
             <w:tcMar>
               <w:top w:w="0" w:type="dxa"/>
               <w:left w:w="0" w:type="dxa"/>
@@ -291,11 +280,11 @@
             <w:tcW w:w="1670" w:type="dxa"/>
             <w:tcBorders>
               <w:top w:val="single" w:sz="12" w:space="0" w:color="666666"/>
-              <w:left w:val="none" w:sz="0" w:space="0" w:color="000000"/>
+              <w:left w:val="none" w:sz="0" w:space="0" w:color="000000" w:themeColor="text1"/>
               <w:bottom w:val="single" w:sz="12" w:space="0" w:color="666666"/>
-              <w:right w:val="none" w:sz="0" w:space="0" w:color="000000"/>
-            </w:tcBorders>
-            <w:shd w:val="clear" w:color="auto" w:fill="FFFFFF"/>
+              <w:right w:val="none" w:sz="0" w:space="0" w:color="000000" w:themeColor="text1"/>
+            </w:tcBorders>
+            <w:shd w:val="clear" w:color="auto" w:fill="FFFFFF" w:themeFill="background1"/>
             <w:tcMar>
               <w:top w:w="0" w:type="dxa"/>
               <w:left w:w="0" w:type="dxa"/>
@@ -325,11 +314,20 @@
             <w:r>
               <w:rPr>
                 <w:rFonts w:ascii="Arial" w:eastAsia="Arial" w:hAnsi="Arial" w:cs="Arial"/>
-                <w:color w:val="000000"/>
+                <w:color w:val="000000" w:themeColor="text1"/>
                 <w:sz w:val="22"/>
                 <w:szCs w:val="22"/>
               </w:rPr>
               <w:t>Current Loss</w:t>
+            </w:r>
+            <w:r>
+              <w:rPr>
+                <w:rFonts w:ascii="Arial" w:eastAsia="Arial" w:hAnsi="Arial" w:cs="Arial"/>
+                <w:color w:val="000000" w:themeColor="text1"/>
+                <w:sz w:val="22"/>
+                <w:szCs w:val="22"/>
+              </w:rPr>
+              <w:t xml:space="preserve"> </w:t>
             </w:r>
           </w:p>
         </w:tc>
@@ -343,11 +341,11 @@
             <w:tcW w:w="1768" w:type="dxa"/>
             <w:tcBorders>
               <w:top w:val="single" w:sz="12" w:space="0" w:color="666666"/>
-              <w:left w:val="none" w:sz="0" w:space="0" w:color="000000"/>
-              <w:bottom w:val="none" w:sz="0" w:space="0" w:color="000000"/>
-              <w:right w:val="none" w:sz="0" w:space="0" w:color="000000"/>
-            </w:tcBorders>
-            <w:shd w:val="clear" w:color="auto" w:fill="FFFFFF"/>
+              <w:left w:val="none" w:sz="0" w:space="0" w:color="000000" w:themeColor="text1"/>
+              <w:bottom w:val="none" w:sz="0" w:space="0" w:color="000000" w:themeColor="text1"/>
+              <w:right w:val="none" w:sz="0" w:space="0" w:color="000000" w:themeColor="text1"/>
+            </w:tcBorders>
+            <w:shd w:val="clear" w:color="auto" w:fill="FFFFFF" w:themeFill="background1"/>
             <w:tcMar>
               <w:top w:w="0" w:type="dxa"/>
               <w:left w:w="0" w:type="dxa"/>
@@ -389,11 +387,11 @@
             <w:tcW w:w="2135" w:type="dxa"/>
             <w:tcBorders>
               <w:top w:val="single" w:sz="12" w:space="0" w:color="666666"/>
-              <w:left w:val="none" w:sz="0" w:space="0" w:color="000000"/>
-              <w:bottom w:val="none" w:sz="0" w:space="0" w:color="000000"/>
-              <w:right w:val="none" w:sz="0" w:space="0" w:color="000000"/>
-            </w:tcBorders>
-            <w:shd w:val="clear" w:color="auto" w:fill="FFFFFF"/>
+              <w:left w:val="none" w:sz="0" w:space="0" w:color="000000" w:themeColor="text1"/>
+              <w:bottom w:val="none" w:sz="0" w:space="0" w:color="000000" w:themeColor="text1"/>
+              <w:right w:val="none" w:sz="0" w:space="0" w:color="000000" w:themeColor="text1"/>
+            </w:tcBorders>
+            <w:shd w:val="clear" w:color="auto" w:fill="FFFFFF" w:themeFill="background1"/>
             <w:tcMar>
               <w:top w:w="0" w:type="dxa"/>
               <w:left w:w="0" w:type="dxa"/>
@@ -436,11 +434,11 @@
             <w:tcW w:w="1878" w:type="dxa"/>
             <w:tcBorders>
               <w:top w:val="single" w:sz="12" w:space="0" w:color="666666"/>
-              <w:left w:val="none" w:sz="0" w:space="0" w:color="000000"/>
-              <w:bottom w:val="none" w:sz="0" w:space="0" w:color="000000"/>
-              <w:right w:val="none" w:sz="0" w:space="0" w:color="000000"/>
-            </w:tcBorders>
-            <w:shd w:val="clear" w:color="auto" w:fill="FFFFFF"/>
+              <w:left w:val="none" w:sz="0" w:space="0" w:color="000000" w:themeColor="text1"/>
+              <w:bottom w:val="none" w:sz="0" w:space="0" w:color="000000" w:themeColor="text1"/>
+              <w:right w:val="none" w:sz="0" w:space="0" w:color="000000" w:themeColor="text1"/>
+            </w:tcBorders>
+            <w:shd w:val="clear" w:color="auto" w:fill="FFFFFF" w:themeFill="background1"/>
             <w:tcMar>
               <w:top w:w="0" w:type="dxa"/>
               <w:left w:w="0" w:type="dxa"/>
@@ -483,11 +481,11 @@
             <w:tcW w:w="1890" w:type="dxa"/>
             <w:tcBorders>
               <w:top w:val="single" w:sz="12" w:space="0" w:color="666666"/>
-              <w:left w:val="none" w:sz="0" w:space="0" w:color="000000"/>
-              <w:bottom w:val="none" w:sz="0" w:space="0" w:color="000000"/>
-              <w:right w:val="none" w:sz="0" w:space="0" w:color="000000"/>
-            </w:tcBorders>
-            <w:shd w:val="clear" w:color="auto" w:fill="FFFFFF"/>
+              <w:left w:val="none" w:sz="0" w:space="0" w:color="000000" w:themeColor="text1"/>
+              <w:bottom w:val="none" w:sz="0" w:space="0" w:color="000000" w:themeColor="text1"/>
+              <w:right w:val="none" w:sz="0" w:space="0" w:color="000000" w:themeColor="text1"/>
+            </w:tcBorders>
+            <w:shd w:val="clear" w:color="auto" w:fill="FFFFFF" w:themeFill="background1"/>
             <w:tcMar>
               <w:top w:w="0" w:type="dxa"/>
               <w:left w:w="0" w:type="dxa"/>
@@ -529,11 +527,11 @@
             <w:tcW w:w="1670" w:type="dxa"/>
             <w:tcBorders>
               <w:top w:val="single" w:sz="12" w:space="0" w:color="666666"/>
-              <w:left w:val="none" w:sz="0" w:space="0" w:color="000000"/>
-              <w:bottom w:val="none" w:sz="0" w:space="0" w:color="000000"/>
-              <w:right w:val="none" w:sz="0" w:space="0" w:color="000000"/>
-            </w:tcBorders>
-            <w:shd w:val="clear" w:color="auto" w:fill="FFFFFF"/>
+              <w:left w:val="none" w:sz="0" w:space="0" w:color="000000" w:themeColor="text1"/>
+              <w:bottom w:val="none" w:sz="0" w:space="0" w:color="000000" w:themeColor="text1"/>
+              <w:right w:val="none" w:sz="0" w:space="0" w:color="000000" w:themeColor="text1"/>
+            </w:tcBorders>
+            <w:shd w:val="clear" w:color="auto" w:fill="FFFFFF" w:themeFill="background1"/>
             <w:tcMar>
               <w:top w:w="0" w:type="dxa"/>
               <w:left w:w="0" w:type="dxa"/>
@@ -580,12 +578,12 @@
           <w:tcPr>
             <w:tcW w:w="1768" w:type="dxa"/>
             <w:tcBorders>
-              <w:top w:val="none" w:sz="0" w:space="0" w:color="000000"/>
-              <w:left w:val="none" w:sz="0" w:space="0" w:color="000000"/>
+              <w:top w:val="none" w:sz="0" w:space="0" w:color="000000" w:themeColor="text1"/>
+              <w:left w:val="none" w:sz="0" w:space="0" w:color="000000" w:themeColor="text1"/>
               <w:bottom w:val="single" w:sz="12" w:space="0" w:color="666666"/>
-              <w:right w:val="none" w:sz="0" w:space="0" w:color="000000"/>
-            </w:tcBorders>
-            <w:shd w:val="clear" w:color="auto" w:fill="FFFFFF"/>
+              <w:right w:val="none" w:sz="0" w:space="0" w:color="000000" w:themeColor="text1"/>
+            </w:tcBorders>
+            <w:shd w:val="clear" w:color="auto" w:fill="FFFFFF" w:themeFill="background1"/>
             <w:tcMar>
               <w:top w:w="0" w:type="dxa"/>
               <w:left w:w="0" w:type="dxa"/>
@@ -626,12 +624,12 @@
           <w:tcPr>
             <w:tcW w:w="2135" w:type="dxa"/>
             <w:tcBorders>
-              <w:top w:val="none" w:sz="0" w:space="0" w:color="000000"/>
-              <w:left w:val="none" w:sz="0" w:space="0" w:color="000000"/>
+              <w:top w:val="none" w:sz="0" w:space="0" w:color="000000" w:themeColor="text1"/>
+              <w:left w:val="none" w:sz="0" w:space="0" w:color="000000" w:themeColor="text1"/>
               <w:bottom w:val="single" w:sz="12" w:space="0" w:color="666666"/>
-              <w:right w:val="none" w:sz="0" w:space="0" w:color="000000"/>
-            </w:tcBorders>
-            <w:shd w:val="clear" w:color="auto" w:fill="FFFFFF"/>
+              <w:right w:val="none" w:sz="0" w:space="0" w:color="000000" w:themeColor="text1"/>
+            </w:tcBorders>
+            <w:shd w:val="clear" w:color="auto" w:fill="FFFFFF" w:themeFill="background1"/>
             <w:tcMar>
               <w:top w:w="0" w:type="dxa"/>
               <w:left w:w="0" w:type="dxa"/>
@@ -673,12 +671,12 @@
           <w:tcPr>
             <w:tcW w:w="1878" w:type="dxa"/>
             <w:tcBorders>
-              <w:top w:val="none" w:sz="0" w:space="0" w:color="000000"/>
-              <w:left w:val="none" w:sz="0" w:space="0" w:color="000000"/>
+              <w:top w:val="none" w:sz="0" w:space="0" w:color="000000" w:themeColor="text1"/>
+              <w:left w:val="none" w:sz="0" w:space="0" w:color="000000" w:themeColor="text1"/>
               <w:bottom w:val="single" w:sz="12" w:space="0" w:color="666666"/>
-              <w:right w:val="none" w:sz="0" w:space="0" w:color="000000"/>
-            </w:tcBorders>
-            <w:shd w:val="clear" w:color="auto" w:fill="FFFFFF"/>
+              <w:right w:val="none" w:sz="0" w:space="0" w:color="000000" w:themeColor="text1"/>
+            </w:tcBorders>
+            <w:shd w:val="clear" w:color="auto" w:fill="FFFFFF" w:themeFill="background1"/>
             <w:tcMar>
               <w:top w:w="0" w:type="dxa"/>
               <w:left w:w="0" w:type="dxa"/>
@@ -720,12 +718,12 @@
           <w:tcPr>
             <w:tcW w:w="1890" w:type="dxa"/>
             <w:tcBorders>
-              <w:top w:val="none" w:sz="0" w:space="0" w:color="000000"/>
-              <w:left w:val="none" w:sz="0" w:space="0" w:color="000000"/>
+              <w:top w:val="none" w:sz="0" w:space="0" w:color="000000" w:themeColor="text1"/>
+              <w:left w:val="none" w:sz="0" w:space="0" w:color="000000" w:themeColor="text1"/>
               <w:bottom w:val="single" w:sz="12" w:space="0" w:color="666666"/>
-              <w:right w:val="none" w:sz="0" w:space="0" w:color="000000"/>
-            </w:tcBorders>
-            <w:shd w:val="clear" w:color="auto" w:fill="FFFFFF"/>
+              <w:right w:val="none" w:sz="0" w:space="0" w:color="000000" w:themeColor="text1"/>
+            </w:tcBorders>
+            <w:shd w:val="clear" w:color="auto" w:fill="FFFFFF" w:themeFill="background1"/>
             <w:tcMar>
               <w:top w:w="0" w:type="dxa"/>
               <w:left w:w="0" w:type="dxa"/>
@@ -766,12 +764,12 @@
           <w:tcPr>
             <w:tcW w:w="1670" w:type="dxa"/>
             <w:tcBorders>
-              <w:top w:val="none" w:sz="0" w:space="0" w:color="000000"/>
-              <w:left w:val="none" w:sz="0" w:space="0" w:color="000000"/>
+              <w:top w:val="none" w:sz="0" w:space="0" w:color="000000" w:themeColor="text1"/>
+              <w:left w:val="none" w:sz="0" w:space="0" w:color="000000" w:themeColor="text1"/>
               <w:bottom w:val="single" w:sz="12" w:space="0" w:color="666666"/>
-              <w:right w:val="none" w:sz="0" w:space="0" w:color="000000"/>
-            </w:tcBorders>
-            <w:shd w:val="clear" w:color="auto" w:fill="FFFFFF"/>
+              <w:right w:val="none" w:sz="0" w:space="0" w:color="000000" w:themeColor="text1"/>
+            </w:tcBorders>
+            <w:shd w:val="clear" w:color="auto" w:fill="FFFFFF" w:themeFill="background1"/>
             <w:tcMar>
               <w:top w:w="0" w:type="dxa"/>
               <w:left w:w="0" w:type="dxa"/>
@@ -805,13 +803,25 @@
                 <w:sz w:val="22"/>
                 <w:szCs w:val="22"/>
               </w:rPr>
-              <w:t>648.6</w:t>
+              <w:t>651.5</w:t>
             </w:r>
           </w:p>
         </w:tc>
       </w:tr>
     </w:tbl>
-    <w:p/>
+    <w:p>
+      <w:r>
+        <w:t xml:space="preserve">*Note: Current </w:t>
+      </w:r>
+      <w:proofErr w:type="spellStart"/>
+      <w:r>
+        <w:t>SacPAS</w:t>
+      </w:r>
+      <w:proofErr w:type="spellEnd"/>
+      <w:r>
+        <w:t xml:space="preserve"> information as of 1/15/2026.</w:t>
+      </w:r>
+    </w:p>
     <w:p>
       <w:pPr>
         <w:pStyle w:val="Heading2"/>
@@ -835,13 +845,11 @@
         <w:t>• Historical Mean - Historical Years Only (2019-2021): 32.6% (excludes current year 2026: 11.5%)</w:t>
       </w:r>
     </w:p>
-    <w:p/>
     <w:p>
       <w:pPr>
         <w:pStyle w:val="Heading2"/>
       </w:pPr>
       <w:r>
-        <w:lastRenderedPageBreak/>
         <w:t>Threshold Calculation Scenarios</w:t>
       </w:r>
     </w:p>
@@ -856,6 +864,9 @@
       <w:proofErr w:type="gramEnd"/>
       <w:r>
         <w:t xml:space="preserve"> and which survival rate is used.</w:t>
+      </w:r>
+      <w:r>
+        <w:t xml:space="preserve"> Reclamation and DWR proposed to use the bolded scenario in WY 2026 for estimating a spring-run Chinook salmon JPE. </w:t>
       </w:r>
     </w:p>
     <w:p>
@@ -874,7 +885,6 @@
         </w:sectPr>
       </w:pPr>
     </w:p>
-    <w:p/>
     <w:p/>
     <w:tbl>
       <w:tblPr>
@@ -903,11 +913,11 @@
             <w:tcW w:w="3600" w:type="dxa"/>
             <w:tcBorders>
               <w:top w:val="single" w:sz="12" w:space="0" w:color="666666"/>
-              <w:left w:val="none" w:sz="0" w:space="0" w:color="000000"/>
+              <w:left w:val="none" w:sz="0" w:space="0" w:color="000000" w:themeColor="text1"/>
               <w:bottom w:val="single" w:sz="12" w:space="0" w:color="666666"/>
-              <w:right w:val="none" w:sz="0" w:space="0" w:color="000000"/>
-            </w:tcBorders>
-            <w:shd w:val="clear" w:color="auto" w:fill="FFFFFF"/>
+              <w:right w:val="none" w:sz="0" w:space="0" w:color="000000" w:themeColor="text1"/>
+            </w:tcBorders>
+            <w:shd w:val="clear" w:color="auto" w:fill="FFFFFF" w:themeFill="background1"/>
             <w:tcMar>
               <w:top w:w="0" w:type="dxa"/>
               <w:left w:w="0" w:type="dxa"/>
@@ -949,11 +959,11 @@
             <w:tcW w:w="1368" w:type="dxa"/>
             <w:tcBorders>
               <w:top w:val="single" w:sz="12" w:space="0" w:color="666666"/>
-              <w:left w:val="none" w:sz="0" w:space="0" w:color="000000"/>
+              <w:left w:val="none" w:sz="0" w:space="0" w:color="000000" w:themeColor="text1"/>
               <w:bottom w:val="single" w:sz="12" w:space="0" w:color="666666"/>
-              <w:right w:val="none" w:sz="0" w:space="0" w:color="000000"/>
-            </w:tcBorders>
-            <w:shd w:val="clear" w:color="auto" w:fill="FFFFFF"/>
+              <w:right w:val="none" w:sz="0" w:space="0" w:color="000000" w:themeColor="text1"/>
+            </w:tcBorders>
+            <w:shd w:val="clear" w:color="auto" w:fill="FFFFFF" w:themeFill="background1"/>
             <w:tcMar>
               <w:top w:w="0" w:type="dxa"/>
               <w:left w:w="0" w:type="dxa"/>
@@ -995,11 +1005,11 @@
             <w:tcW w:w="1368" w:type="dxa"/>
             <w:tcBorders>
               <w:top w:val="single" w:sz="12" w:space="0" w:color="666666"/>
-              <w:left w:val="none" w:sz="0" w:space="0" w:color="000000"/>
+              <w:left w:val="none" w:sz="0" w:space="0" w:color="000000" w:themeColor="text1"/>
               <w:bottom w:val="single" w:sz="12" w:space="0" w:color="666666"/>
-              <w:right w:val="none" w:sz="0" w:space="0" w:color="000000"/>
-            </w:tcBorders>
-            <w:shd w:val="clear" w:color="auto" w:fill="FFFFFF"/>
+              <w:right w:val="none" w:sz="0" w:space="0" w:color="000000" w:themeColor="text1"/>
+            </w:tcBorders>
+            <w:shd w:val="clear" w:color="auto" w:fill="FFFFFF" w:themeFill="background1"/>
             <w:tcMar>
               <w:top w:w="0" w:type="dxa"/>
               <w:left w:w="0" w:type="dxa"/>
@@ -1041,11 +1051,11 @@
             <w:tcW w:w="1368" w:type="dxa"/>
             <w:tcBorders>
               <w:top w:val="single" w:sz="12" w:space="0" w:color="666666"/>
-              <w:left w:val="none" w:sz="0" w:space="0" w:color="000000"/>
+              <w:left w:val="none" w:sz="0" w:space="0" w:color="000000" w:themeColor="text1"/>
               <w:bottom w:val="single" w:sz="12" w:space="0" w:color="666666"/>
-              <w:right w:val="none" w:sz="0" w:space="0" w:color="000000"/>
-            </w:tcBorders>
-            <w:shd w:val="clear" w:color="auto" w:fill="FFFFFF"/>
+              <w:right w:val="none" w:sz="0" w:space="0" w:color="000000" w:themeColor="text1"/>
+            </w:tcBorders>
+            <w:shd w:val="clear" w:color="auto" w:fill="FFFFFF" w:themeFill="background1"/>
             <w:tcMar>
               <w:top w:w="0" w:type="dxa"/>
               <w:left w:w="0" w:type="dxa"/>
@@ -1087,11 +1097,11 @@
             <w:tcW w:w="1368" w:type="dxa"/>
             <w:tcBorders>
               <w:top w:val="single" w:sz="12" w:space="0" w:color="666666"/>
-              <w:left w:val="none" w:sz="0" w:space="0" w:color="000000"/>
+              <w:left w:val="none" w:sz="0" w:space="0" w:color="000000" w:themeColor="text1"/>
               <w:bottom w:val="single" w:sz="12" w:space="0" w:color="666666"/>
-              <w:right w:val="none" w:sz="0" w:space="0" w:color="000000"/>
-            </w:tcBorders>
-            <w:shd w:val="clear" w:color="auto" w:fill="FFFFFF"/>
+              <w:right w:val="none" w:sz="0" w:space="0" w:color="000000" w:themeColor="text1"/>
+            </w:tcBorders>
+            <w:shd w:val="clear" w:color="auto" w:fill="FFFFFF" w:themeFill="background1"/>
             <w:tcMar>
               <w:top w:w="0" w:type="dxa"/>
               <w:left w:w="0" w:type="dxa"/>
@@ -1133,11 +1143,11 @@
             <w:tcW w:w="1368" w:type="dxa"/>
             <w:tcBorders>
               <w:top w:val="single" w:sz="12" w:space="0" w:color="666666"/>
-              <w:left w:val="none" w:sz="0" w:space="0" w:color="000000"/>
+              <w:left w:val="none" w:sz="0" w:space="0" w:color="000000" w:themeColor="text1"/>
               <w:bottom w:val="single" w:sz="12" w:space="0" w:color="666666"/>
-              <w:right w:val="none" w:sz="0" w:space="0" w:color="000000"/>
-            </w:tcBorders>
-            <w:shd w:val="clear" w:color="auto" w:fill="FFFFFF"/>
+              <w:right w:val="none" w:sz="0" w:space="0" w:color="000000" w:themeColor="text1"/>
+            </w:tcBorders>
+            <w:shd w:val="clear" w:color="auto" w:fill="FFFFFF" w:themeFill="background1"/>
             <w:tcMar>
               <w:top w:w="0" w:type="dxa"/>
               <w:left w:w="0" w:type="dxa"/>
@@ -1179,11 +1189,11 @@
             <w:tcW w:w="1368" w:type="dxa"/>
             <w:tcBorders>
               <w:top w:val="single" w:sz="12" w:space="0" w:color="666666"/>
-              <w:left w:val="none" w:sz="0" w:space="0" w:color="000000"/>
+              <w:left w:val="none" w:sz="0" w:space="0" w:color="000000" w:themeColor="text1"/>
               <w:bottom w:val="single" w:sz="12" w:space="0" w:color="666666"/>
-              <w:right w:val="none" w:sz="0" w:space="0" w:color="000000"/>
-            </w:tcBorders>
-            <w:shd w:val="clear" w:color="auto" w:fill="FFFFFF"/>
+              <w:right w:val="none" w:sz="0" w:space="0" w:color="000000" w:themeColor="text1"/>
+            </w:tcBorders>
+            <w:shd w:val="clear" w:color="auto" w:fill="FFFFFF" w:themeFill="background1"/>
             <w:tcMar>
               <w:top w:w="0" w:type="dxa"/>
               <w:left w:w="0" w:type="dxa"/>
@@ -1225,11 +1235,11 @@
             <w:tcW w:w="1368" w:type="dxa"/>
             <w:tcBorders>
               <w:top w:val="single" w:sz="12" w:space="0" w:color="666666"/>
-              <w:left w:val="none" w:sz="0" w:space="0" w:color="000000"/>
+              <w:left w:val="none" w:sz="0" w:space="0" w:color="000000" w:themeColor="text1"/>
               <w:bottom w:val="single" w:sz="12" w:space="0" w:color="666666"/>
-              <w:right w:val="none" w:sz="0" w:space="0" w:color="000000"/>
-            </w:tcBorders>
-            <w:shd w:val="clear" w:color="auto" w:fill="FFFFFF"/>
+              <w:right w:val="none" w:sz="0" w:space="0" w:color="000000" w:themeColor="text1"/>
+            </w:tcBorders>
+            <w:shd w:val="clear" w:color="auto" w:fill="FFFFFF" w:themeFill="background1"/>
             <w:tcMar>
               <w:top w:w="0" w:type="dxa"/>
               <w:left w:w="0" w:type="dxa"/>
@@ -1276,40 +1286,43 @@
             <w:tcW w:w="3600" w:type="dxa"/>
             <w:tcBorders>
               <w:top w:val="single" w:sz="12" w:space="0" w:color="666666"/>
-              <w:left w:val="none" w:sz="0" w:space="0" w:color="000000"/>
-              <w:bottom w:val="none" w:sz="0" w:space="0" w:color="000000"/>
-              <w:right w:val="none" w:sz="0" w:space="0" w:color="000000"/>
-            </w:tcBorders>
-            <w:shd w:val="clear" w:color="auto" w:fill="FFFFFF"/>
-            <w:tcMar>
-              <w:top w:w="0" w:type="dxa"/>
-              <w:left w:w="0" w:type="dxa"/>
-              <w:bottom w:w="0" w:type="dxa"/>
-              <w:right w:w="0" w:type="dxa"/>
-            </w:tcMar>
-            <w:vAlign w:val="center"/>
-          </w:tcPr>
-          <w:p>
-            <w:pPr>
-              <w:pBdr>
-                <w:top w:val="none" w:sz="0" w:space="0" w:color="000000"/>
-                <w:left w:val="none" w:sz="0" w:space="0" w:color="000000"/>
-                <w:bottom w:val="none" w:sz="0" w:space="0" w:color="000000"/>
-                <w:right w:val="none" w:sz="0" w:space="0" w:color="000000"/>
-              </w:pBdr>
-              <w:spacing w:before="100" w:after="100"/>
-              <w:ind w:left="100" w:right="100"/>
-              <w:rPr>
-                <w:rFonts w:ascii="Arial" w:eastAsia="Arial" w:hAnsi="Arial" w:cs="Arial"/>
-                <w:color w:val="000000"/>
-                <w:sz w:val="18"/>
-                <w:szCs w:val="18"/>
-              </w:rPr>
-            </w:pPr>
-            <w:r>
-              <w:rPr>
-                <w:rFonts w:ascii="Arial" w:eastAsia="Arial" w:hAnsi="Arial" w:cs="Arial"/>
-                <w:color w:val="000000"/>
+              <w:left w:val="none" w:sz="0" w:space="0" w:color="000000" w:themeColor="text1"/>
+              <w:bottom w:val="none" w:sz="0" w:space="0" w:color="000000" w:themeColor="text1"/>
+              <w:right w:val="none" w:sz="0" w:space="0" w:color="000000" w:themeColor="text1"/>
+            </w:tcBorders>
+            <w:shd w:val="clear" w:color="auto" w:fill="FFFFFF" w:themeFill="background1"/>
+            <w:tcMar>
+              <w:top w:w="0" w:type="dxa"/>
+              <w:left w:w="0" w:type="dxa"/>
+              <w:bottom w:w="0" w:type="dxa"/>
+              <w:right w:w="0" w:type="dxa"/>
+            </w:tcMar>
+            <w:vAlign w:val="center"/>
+          </w:tcPr>
+          <w:p>
+            <w:pPr>
+              <w:pBdr>
+                <w:top w:val="none" w:sz="0" w:space="0" w:color="000000"/>
+                <w:left w:val="none" w:sz="0" w:space="0" w:color="000000"/>
+                <w:bottom w:val="none" w:sz="0" w:space="0" w:color="000000"/>
+                <w:right w:val="none" w:sz="0" w:space="0" w:color="000000"/>
+              </w:pBdr>
+              <w:spacing w:before="100" w:after="100"/>
+              <w:ind w:left="100" w:right="100"/>
+              <w:rPr>
+                <w:rFonts w:ascii="Arial" w:eastAsia="Arial" w:hAnsi="Arial" w:cs="Arial"/>
+                <w:b/>
+                <w:bCs/>
+                <w:color w:val="000000"/>
+                <w:sz w:val="18"/>
+                <w:szCs w:val="18"/>
+              </w:rPr>
+            </w:pPr>
+            <w:r>
+              <w:rPr>
+                <w:rFonts w:ascii="Arial" w:eastAsia="Arial" w:hAnsi="Arial" w:cs="Arial"/>
+                <w:b/>
+                <w:color w:val="000000" w:themeColor="text1"/>
                 <w:sz w:val="18"/>
                 <w:szCs w:val="18"/>
               </w:rPr>
@@ -1322,40 +1335,43 @@
             <w:tcW w:w="1368" w:type="dxa"/>
             <w:tcBorders>
               <w:top w:val="single" w:sz="12" w:space="0" w:color="666666"/>
-              <w:left w:val="none" w:sz="0" w:space="0" w:color="000000"/>
-              <w:bottom w:val="none" w:sz="0" w:space="0" w:color="000000"/>
-              <w:right w:val="none" w:sz="0" w:space="0" w:color="000000"/>
-            </w:tcBorders>
-            <w:shd w:val="clear" w:color="auto" w:fill="FFFFFF"/>
-            <w:tcMar>
-              <w:top w:w="0" w:type="dxa"/>
-              <w:left w:w="0" w:type="dxa"/>
-              <w:bottom w:w="0" w:type="dxa"/>
-              <w:right w:w="0" w:type="dxa"/>
-            </w:tcMar>
-            <w:vAlign w:val="center"/>
-          </w:tcPr>
-          <w:p>
-            <w:pPr>
-              <w:pBdr>
-                <w:top w:val="none" w:sz="0" w:space="0" w:color="000000"/>
-                <w:left w:val="none" w:sz="0" w:space="0" w:color="000000"/>
-                <w:bottom w:val="none" w:sz="0" w:space="0" w:color="000000"/>
-                <w:right w:val="none" w:sz="0" w:space="0" w:color="000000"/>
-              </w:pBdr>
-              <w:spacing w:before="100" w:after="100"/>
-              <w:ind w:left="100" w:right="100"/>
-              <w:rPr>
-                <w:rFonts w:ascii="Arial" w:eastAsia="Arial" w:hAnsi="Arial" w:cs="Arial"/>
-                <w:color w:val="000000"/>
-                <w:sz w:val="18"/>
-                <w:szCs w:val="18"/>
-              </w:rPr>
-            </w:pPr>
-            <w:r>
-              <w:rPr>
-                <w:rFonts w:ascii="Arial" w:eastAsia="Arial" w:hAnsi="Arial" w:cs="Arial"/>
-                <w:color w:val="000000"/>
+              <w:left w:val="none" w:sz="0" w:space="0" w:color="000000" w:themeColor="text1"/>
+              <w:bottom w:val="none" w:sz="0" w:space="0" w:color="000000" w:themeColor="text1"/>
+              <w:right w:val="none" w:sz="0" w:space="0" w:color="000000" w:themeColor="text1"/>
+            </w:tcBorders>
+            <w:shd w:val="clear" w:color="auto" w:fill="FFFFFF" w:themeFill="background1"/>
+            <w:tcMar>
+              <w:top w:w="0" w:type="dxa"/>
+              <w:left w:w="0" w:type="dxa"/>
+              <w:bottom w:w="0" w:type="dxa"/>
+              <w:right w:w="0" w:type="dxa"/>
+            </w:tcMar>
+            <w:vAlign w:val="center"/>
+          </w:tcPr>
+          <w:p>
+            <w:pPr>
+              <w:pBdr>
+                <w:top w:val="none" w:sz="0" w:space="0" w:color="000000"/>
+                <w:left w:val="none" w:sz="0" w:space="0" w:color="000000"/>
+                <w:bottom w:val="none" w:sz="0" w:space="0" w:color="000000"/>
+                <w:right w:val="none" w:sz="0" w:space="0" w:color="000000"/>
+              </w:pBdr>
+              <w:spacing w:before="100" w:after="100"/>
+              <w:ind w:left="100" w:right="100"/>
+              <w:rPr>
+                <w:rFonts w:ascii="Arial" w:eastAsia="Arial" w:hAnsi="Arial" w:cs="Arial"/>
+                <w:b/>
+                <w:bCs/>
+                <w:color w:val="000000"/>
+                <w:sz w:val="18"/>
+                <w:szCs w:val="18"/>
+              </w:rPr>
+            </w:pPr>
+            <w:r>
+              <w:rPr>
+                <w:rFonts w:ascii="Arial" w:eastAsia="Arial" w:hAnsi="Arial" w:cs="Arial"/>
+                <w:b/>
+                <w:color w:val="000000" w:themeColor="text1"/>
                 <w:sz w:val="18"/>
                 <w:szCs w:val="18"/>
               </w:rPr>
@@ -1368,11 +1384,11 @@
             <w:tcW w:w="1368" w:type="dxa"/>
             <w:tcBorders>
               <w:top w:val="single" w:sz="12" w:space="0" w:color="666666"/>
-              <w:left w:val="none" w:sz="0" w:space="0" w:color="000000"/>
-              <w:bottom w:val="none" w:sz="0" w:space="0" w:color="000000"/>
-              <w:right w:val="none" w:sz="0" w:space="0" w:color="000000"/>
-            </w:tcBorders>
-            <w:shd w:val="clear" w:color="auto" w:fill="FFFFFF"/>
+              <w:left w:val="none" w:sz="0" w:space="0" w:color="000000" w:themeColor="text1"/>
+              <w:bottom w:val="none" w:sz="0" w:space="0" w:color="000000" w:themeColor="text1"/>
+              <w:right w:val="none" w:sz="0" w:space="0" w:color="000000" w:themeColor="text1"/>
+            </w:tcBorders>
+            <w:shd w:val="clear" w:color="auto" w:fill="FFFFFF" w:themeFill="background1"/>
             <w:tcMar>
               <w:top w:w="0" w:type="dxa"/>
               <w:left w:w="0" w:type="dxa"/>
@@ -1394,15 +1410,18 @@
               <w:jc w:val="right"/>
               <w:rPr>
                 <w:rFonts w:ascii="Arial" w:eastAsia="Arial" w:hAnsi="Arial" w:cs="Arial"/>
-                <w:color w:val="000000"/>
-                <w:sz w:val="18"/>
-                <w:szCs w:val="18"/>
-              </w:rPr>
-            </w:pPr>
-            <w:r>
-              <w:rPr>
-                <w:rFonts w:ascii="Arial" w:eastAsia="Arial" w:hAnsi="Arial" w:cs="Arial"/>
-                <w:color w:val="000000"/>
+                <w:b/>
+                <w:bCs/>
+                <w:color w:val="000000"/>
+                <w:sz w:val="18"/>
+                <w:szCs w:val="18"/>
+              </w:rPr>
+            </w:pPr>
+            <w:r>
+              <w:rPr>
+                <w:rFonts w:ascii="Arial" w:eastAsia="Arial" w:hAnsi="Arial" w:cs="Arial"/>
+                <w:b/>
+                <w:color w:val="000000" w:themeColor="text1"/>
                 <w:sz w:val="18"/>
                 <w:szCs w:val="18"/>
               </w:rPr>
@@ -1415,11 +1434,11 @@
             <w:tcW w:w="1368" w:type="dxa"/>
             <w:tcBorders>
               <w:top w:val="single" w:sz="12" w:space="0" w:color="666666"/>
-              <w:left w:val="none" w:sz="0" w:space="0" w:color="000000"/>
-              <w:bottom w:val="none" w:sz="0" w:space="0" w:color="000000"/>
-              <w:right w:val="none" w:sz="0" w:space="0" w:color="000000"/>
-            </w:tcBorders>
-            <w:shd w:val="clear" w:color="auto" w:fill="FFFFFF"/>
+              <w:left w:val="none" w:sz="0" w:space="0" w:color="000000" w:themeColor="text1"/>
+              <w:bottom w:val="none" w:sz="0" w:space="0" w:color="000000" w:themeColor="text1"/>
+              <w:right w:val="none" w:sz="0" w:space="0" w:color="000000" w:themeColor="text1"/>
+            </w:tcBorders>
+            <w:shd w:val="clear" w:color="auto" w:fill="FFFFFF" w:themeFill="background1"/>
             <w:tcMar>
               <w:top w:w="0" w:type="dxa"/>
               <w:left w:w="0" w:type="dxa"/>
@@ -1441,15 +1460,18 @@
               <w:jc w:val="right"/>
               <w:rPr>
                 <w:rFonts w:ascii="Arial" w:eastAsia="Arial" w:hAnsi="Arial" w:cs="Arial"/>
-                <w:color w:val="000000"/>
-                <w:sz w:val="18"/>
-                <w:szCs w:val="18"/>
-              </w:rPr>
-            </w:pPr>
-            <w:r>
-              <w:rPr>
-                <w:rFonts w:ascii="Arial" w:eastAsia="Arial" w:hAnsi="Arial" w:cs="Arial"/>
-                <w:color w:val="000000"/>
+                <w:b/>
+                <w:bCs/>
+                <w:color w:val="000000"/>
+                <w:sz w:val="18"/>
+                <w:szCs w:val="18"/>
+              </w:rPr>
+            </w:pPr>
+            <w:r>
+              <w:rPr>
+                <w:rFonts w:ascii="Arial" w:eastAsia="Arial" w:hAnsi="Arial" w:cs="Arial"/>
+                <w:b/>
+                <w:color w:val="000000" w:themeColor="text1"/>
                 <w:sz w:val="18"/>
                 <w:szCs w:val="18"/>
               </w:rPr>
@@ -1462,11 +1484,11 @@
             <w:tcW w:w="1368" w:type="dxa"/>
             <w:tcBorders>
               <w:top w:val="single" w:sz="12" w:space="0" w:color="666666"/>
-              <w:left w:val="none" w:sz="0" w:space="0" w:color="000000"/>
-              <w:bottom w:val="none" w:sz="0" w:space="0" w:color="000000"/>
-              <w:right w:val="none" w:sz="0" w:space="0" w:color="000000"/>
-            </w:tcBorders>
-            <w:shd w:val="clear" w:color="auto" w:fill="FFFFFF"/>
+              <w:left w:val="none" w:sz="0" w:space="0" w:color="000000" w:themeColor="text1"/>
+              <w:bottom w:val="none" w:sz="0" w:space="0" w:color="000000" w:themeColor="text1"/>
+              <w:right w:val="none" w:sz="0" w:space="0" w:color="000000" w:themeColor="text1"/>
+            </w:tcBorders>
+            <w:shd w:val="clear" w:color="auto" w:fill="FFFFFF" w:themeFill="background1"/>
             <w:tcMar>
               <w:top w:w="0" w:type="dxa"/>
               <w:left w:w="0" w:type="dxa"/>
@@ -1488,15 +1510,18 @@
               <w:jc w:val="right"/>
               <w:rPr>
                 <w:rFonts w:ascii="Arial" w:eastAsia="Arial" w:hAnsi="Arial" w:cs="Arial"/>
-                <w:color w:val="000000"/>
-                <w:sz w:val="18"/>
-                <w:szCs w:val="18"/>
-              </w:rPr>
-            </w:pPr>
-            <w:r>
-              <w:rPr>
-                <w:rFonts w:ascii="Arial" w:eastAsia="Arial" w:hAnsi="Arial" w:cs="Arial"/>
-                <w:color w:val="000000"/>
+                <w:b/>
+                <w:bCs/>
+                <w:color w:val="000000"/>
+                <w:sz w:val="18"/>
+                <w:szCs w:val="18"/>
+              </w:rPr>
+            </w:pPr>
+            <w:r>
+              <w:rPr>
+                <w:rFonts w:ascii="Arial" w:eastAsia="Arial" w:hAnsi="Arial" w:cs="Arial"/>
+                <w:b/>
+                <w:color w:val="000000" w:themeColor="text1"/>
                 <w:sz w:val="18"/>
                 <w:szCs w:val="18"/>
               </w:rPr>
@@ -1509,11 +1534,11 @@
             <w:tcW w:w="1368" w:type="dxa"/>
             <w:tcBorders>
               <w:top w:val="single" w:sz="12" w:space="0" w:color="666666"/>
-              <w:left w:val="none" w:sz="0" w:space="0" w:color="000000"/>
-              <w:bottom w:val="none" w:sz="0" w:space="0" w:color="000000"/>
-              <w:right w:val="none" w:sz="0" w:space="0" w:color="000000"/>
-            </w:tcBorders>
-            <w:shd w:val="clear" w:color="auto" w:fill="FFFFFF"/>
+              <w:left w:val="none" w:sz="0" w:space="0" w:color="000000" w:themeColor="text1"/>
+              <w:bottom w:val="none" w:sz="0" w:space="0" w:color="000000" w:themeColor="text1"/>
+              <w:right w:val="none" w:sz="0" w:space="0" w:color="000000" w:themeColor="text1"/>
+            </w:tcBorders>
+            <w:shd w:val="clear" w:color="auto" w:fill="FFFFFF" w:themeFill="background1"/>
             <w:tcMar>
               <w:top w:w="0" w:type="dxa"/>
               <w:left w:w="0" w:type="dxa"/>
@@ -1535,15 +1560,18 @@
               <w:jc w:val="right"/>
               <w:rPr>
                 <w:rFonts w:ascii="Arial" w:eastAsia="Arial" w:hAnsi="Arial" w:cs="Arial"/>
-                <w:color w:val="000000"/>
-                <w:sz w:val="18"/>
-                <w:szCs w:val="18"/>
-              </w:rPr>
-            </w:pPr>
-            <w:r>
-              <w:rPr>
-                <w:rFonts w:ascii="Arial" w:eastAsia="Arial" w:hAnsi="Arial" w:cs="Arial"/>
-                <w:color w:val="000000"/>
+                <w:b/>
+                <w:bCs/>
+                <w:color w:val="000000"/>
+                <w:sz w:val="18"/>
+                <w:szCs w:val="18"/>
+              </w:rPr>
+            </w:pPr>
+            <w:r>
+              <w:rPr>
+                <w:rFonts w:ascii="Arial" w:eastAsia="Arial" w:hAnsi="Arial" w:cs="Arial"/>
+                <w:b/>
+                <w:color w:val="000000" w:themeColor="text1"/>
                 <w:sz w:val="18"/>
                 <w:szCs w:val="18"/>
               </w:rPr>
@@ -1556,11 +1584,11 @@
             <w:tcW w:w="1368" w:type="dxa"/>
             <w:tcBorders>
               <w:top w:val="single" w:sz="12" w:space="0" w:color="666666"/>
-              <w:left w:val="none" w:sz="0" w:space="0" w:color="000000"/>
-              <w:bottom w:val="none" w:sz="0" w:space="0" w:color="000000"/>
-              <w:right w:val="none" w:sz="0" w:space="0" w:color="000000"/>
-            </w:tcBorders>
-            <w:shd w:val="clear" w:color="auto" w:fill="FFFFFF"/>
+              <w:left w:val="none" w:sz="0" w:space="0" w:color="000000" w:themeColor="text1"/>
+              <w:bottom w:val="none" w:sz="0" w:space="0" w:color="000000" w:themeColor="text1"/>
+              <w:right w:val="none" w:sz="0" w:space="0" w:color="000000" w:themeColor="text1"/>
+            </w:tcBorders>
+            <w:shd w:val="clear" w:color="auto" w:fill="FFFFFF" w:themeFill="background1"/>
             <w:tcMar>
               <w:top w:w="0" w:type="dxa"/>
               <w:left w:w="0" w:type="dxa"/>
@@ -1582,19 +1610,22 @@
               <w:jc w:val="right"/>
               <w:rPr>
                 <w:rFonts w:ascii="Arial" w:eastAsia="Arial" w:hAnsi="Arial" w:cs="Arial"/>
-                <w:color w:val="000000"/>
-                <w:sz w:val="18"/>
-                <w:szCs w:val="18"/>
-              </w:rPr>
-            </w:pPr>
-            <w:r>
-              <w:rPr>
-                <w:rFonts w:ascii="Arial" w:eastAsia="Arial" w:hAnsi="Arial" w:cs="Arial"/>
-                <w:color w:val="000000"/>
-                <w:sz w:val="18"/>
-                <w:szCs w:val="18"/>
-              </w:rPr>
-              <w:t>872.7</w:t>
+                <w:b/>
+                <w:bCs/>
+                <w:color w:val="000000"/>
+                <w:sz w:val="18"/>
+                <w:szCs w:val="18"/>
+              </w:rPr>
+            </w:pPr>
+            <w:r>
+              <w:rPr>
+                <w:rFonts w:ascii="Arial" w:eastAsia="Arial" w:hAnsi="Arial" w:cs="Arial"/>
+                <w:b/>
+                <w:color w:val="000000" w:themeColor="text1"/>
+                <w:sz w:val="18"/>
+                <w:szCs w:val="18"/>
+              </w:rPr>
+              <w:t>875.6</w:t>
             </w:r>
           </w:p>
         </w:tc>
@@ -1603,11 +1634,11 @@
             <w:tcW w:w="1368" w:type="dxa"/>
             <w:tcBorders>
               <w:top w:val="single" w:sz="12" w:space="0" w:color="666666"/>
-              <w:left w:val="none" w:sz="0" w:space="0" w:color="000000"/>
-              <w:bottom w:val="none" w:sz="0" w:space="0" w:color="000000"/>
-              <w:right w:val="none" w:sz="0" w:space="0" w:color="000000"/>
-            </w:tcBorders>
-            <w:shd w:val="clear" w:color="auto" w:fill="FFFFFF"/>
+              <w:left w:val="none" w:sz="0" w:space="0" w:color="000000" w:themeColor="text1"/>
+              <w:bottom w:val="none" w:sz="0" w:space="0" w:color="000000" w:themeColor="text1"/>
+              <w:right w:val="none" w:sz="0" w:space="0" w:color="000000" w:themeColor="text1"/>
+            </w:tcBorders>
+            <w:shd w:val="clear" w:color="auto" w:fill="FFFFFF" w:themeFill="background1"/>
             <w:tcMar>
               <w:top w:w="0" w:type="dxa"/>
               <w:left w:w="0" w:type="dxa"/>
@@ -1629,19 +1660,22 @@
               <w:jc w:val="right"/>
               <w:rPr>
                 <w:rFonts w:ascii="Arial" w:eastAsia="Arial" w:hAnsi="Arial" w:cs="Arial"/>
-                <w:color w:val="000000"/>
-                <w:sz w:val="18"/>
-                <w:szCs w:val="18"/>
-              </w:rPr>
-            </w:pPr>
-            <w:r>
-              <w:rPr>
-                <w:rFonts w:ascii="Arial" w:eastAsia="Arial" w:hAnsi="Arial" w:cs="Arial"/>
-                <w:color w:val="000000"/>
-                <w:sz w:val="18"/>
-                <w:szCs w:val="18"/>
-              </w:rPr>
-              <w:t>39.7%</w:t>
+                <w:b/>
+                <w:bCs/>
+                <w:color w:val="000000"/>
+                <w:sz w:val="18"/>
+                <w:szCs w:val="18"/>
+              </w:rPr>
+            </w:pPr>
+            <w:r>
+              <w:rPr>
+                <w:rFonts w:ascii="Arial" w:eastAsia="Arial" w:hAnsi="Arial" w:cs="Arial"/>
+                <w:b/>
+                <w:color w:val="000000" w:themeColor="text1"/>
+                <w:sz w:val="18"/>
+                <w:szCs w:val="18"/>
+              </w:rPr>
+              <w:t>39.8%</w:t>
             </w:r>
           </w:p>
         </w:tc>
@@ -1654,12 +1688,12 @@
           <w:tcPr>
             <w:tcW w:w="3600" w:type="dxa"/>
             <w:tcBorders>
-              <w:top w:val="none" w:sz="0" w:space="0" w:color="000000"/>
-              <w:left w:val="none" w:sz="0" w:space="0" w:color="000000"/>
-              <w:bottom w:val="none" w:sz="0" w:space="0" w:color="000000"/>
-              <w:right w:val="none" w:sz="0" w:space="0" w:color="000000"/>
-            </w:tcBorders>
-            <w:shd w:val="clear" w:color="auto" w:fill="FFFFFF"/>
+              <w:top w:val="none" w:sz="0" w:space="0" w:color="000000" w:themeColor="text1"/>
+              <w:left w:val="none" w:sz="0" w:space="0" w:color="000000" w:themeColor="text1"/>
+              <w:bottom w:val="none" w:sz="0" w:space="0" w:color="000000" w:themeColor="text1"/>
+              <w:right w:val="none" w:sz="0" w:space="0" w:color="000000" w:themeColor="text1"/>
+            </w:tcBorders>
+            <w:shd w:val="clear" w:color="auto" w:fill="FFFFFF" w:themeFill="background1"/>
             <w:tcMar>
               <w:top w:w="0" w:type="dxa"/>
               <w:left w:w="0" w:type="dxa"/>
@@ -1700,12 +1734,12 @@
           <w:tcPr>
             <w:tcW w:w="1368" w:type="dxa"/>
             <w:tcBorders>
-              <w:top w:val="none" w:sz="0" w:space="0" w:color="000000"/>
-              <w:left w:val="none" w:sz="0" w:space="0" w:color="000000"/>
-              <w:bottom w:val="none" w:sz="0" w:space="0" w:color="000000"/>
-              <w:right w:val="none" w:sz="0" w:space="0" w:color="000000"/>
-            </w:tcBorders>
-            <w:shd w:val="clear" w:color="auto" w:fill="FFFFFF"/>
+              <w:top w:val="none" w:sz="0" w:space="0" w:color="000000" w:themeColor="text1"/>
+              <w:left w:val="none" w:sz="0" w:space="0" w:color="000000" w:themeColor="text1"/>
+              <w:bottom w:val="none" w:sz="0" w:space="0" w:color="000000" w:themeColor="text1"/>
+              <w:right w:val="none" w:sz="0" w:space="0" w:color="000000" w:themeColor="text1"/>
+            </w:tcBorders>
+            <w:shd w:val="clear" w:color="auto" w:fill="FFFFFF" w:themeFill="background1"/>
             <w:tcMar>
               <w:top w:w="0" w:type="dxa"/>
               <w:left w:w="0" w:type="dxa"/>
@@ -1746,12 +1780,12 @@
           <w:tcPr>
             <w:tcW w:w="1368" w:type="dxa"/>
             <w:tcBorders>
-              <w:top w:val="none" w:sz="0" w:space="0" w:color="000000"/>
-              <w:left w:val="none" w:sz="0" w:space="0" w:color="000000"/>
-              <w:bottom w:val="none" w:sz="0" w:space="0" w:color="000000"/>
-              <w:right w:val="none" w:sz="0" w:space="0" w:color="000000"/>
-            </w:tcBorders>
-            <w:shd w:val="clear" w:color="auto" w:fill="FFFFFF"/>
+              <w:top w:val="none" w:sz="0" w:space="0" w:color="000000" w:themeColor="text1"/>
+              <w:left w:val="none" w:sz="0" w:space="0" w:color="000000" w:themeColor="text1"/>
+              <w:bottom w:val="none" w:sz="0" w:space="0" w:color="000000" w:themeColor="text1"/>
+              <w:right w:val="none" w:sz="0" w:space="0" w:color="000000" w:themeColor="text1"/>
+            </w:tcBorders>
+            <w:shd w:val="clear" w:color="auto" w:fill="FFFFFF" w:themeFill="background1"/>
             <w:tcMar>
               <w:top w:w="0" w:type="dxa"/>
               <w:left w:w="0" w:type="dxa"/>
@@ -1793,12 +1827,12 @@
           <w:tcPr>
             <w:tcW w:w="1368" w:type="dxa"/>
             <w:tcBorders>
-              <w:top w:val="none" w:sz="0" w:space="0" w:color="000000"/>
-              <w:left w:val="none" w:sz="0" w:space="0" w:color="000000"/>
-              <w:bottom w:val="none" w:sz="0" w:space="0" w:color="000000"/>
-              <w:right w:val="none" w:sz="0" w:space="0" w:color="000000"/>
-            </w:tcBorders>
-            <w:shd w:val="clear" w:color="auto" w:fill="FFFFFF"/>
+              <w:top w:val="none" w:sz="0" w:space="0" w:color="000000" w:themeColor="text1"/>
+              <w:left w:val="none" w:sz="0" w:space="0" w:color="000000" w:themeColor="text1"/>
+              <w:bottom w:val="none" w:sz="0" w:space="0" w:color="000000" w:themeColor="text1"/>
+              <w:right w:val="none" w:sz="0" w:space="0" w:color="000000" w:themeColor="text1"/>
+            </w:tcBorders>
+            <w:shd w:val="clear" w:color="auto" w:fill="FFFFFF" w:themeFill="background1"/>
             <w:tcMar>
               <w:top w:w="0" w:type="dxa"/>
               <w:left w:w="0" w:type="dxa"/>
@@ -1840,12 +1874,12 @@
           <w:tcPr>
             <w:tcW w:w="1368" w:type="dxa"/>
             <w:tcBorders>
-              <w:top w:val="none" w:sz="0" w:space="0" w:color="000000"/>
-              <w:left w:val="none" w:sz="0" w:space="0" w:color="000000"/>
-              <w:bottom w:val="none" w:sz="0" w:space="0" w:color="000000"/>
-              <w:right w:val="none" w:sz="0" w:space="0" w:color="000000"/>
-            </w:tcBorders>
-            <w:shd w:val="clear" w:color="auto" w:fill="FFFFFF"/>
+              <w:top w:val="none" w:sz="0" w:space="0" w:color="000000" w:themeColor="text1"/>
+              <w:left w:val="none" w:sz="0" w:space="0" w:color="000000" w:themeColor="text1"/>
+              <w:bottom w:val="none" w:sz="0" w:space="0" w:color="000000" w:themeColor="text1"/>
+              <w:right w:val="none" w:sz="0" w:space="0" w:color="000000" w:themeColor="text1"/>
+            </w:tcBorders>
+            <w:shd w:val="clear" w:color="auto" w:fill="FFFFFF" w:themeFill="background1"/>
             <w:tcMar>
               <w:top w:w="0" w:type="dxa"/>
               <w:left w:w="0" w:type="dxa"/>
@@ -1887,12 +1921,12 @@
           <w:tcPr>
             <w:tcW w:w="1368" w:type="dxa"/>
             <w:tcBorders>
-              <w:top w:val="none" w:sz="0" w:space="0" w:color="000000"/>
-              <w:left w:val="none" w:sz="0" w:space="0" w:color="000000"/>
-              <w:bottom w:val="none" w:sz="0" w:space="0" w:color="000000"/>
-              <w:right w:val="none" w:sz="0" w:space="0" w:color="000000"/>
-            </w:tcBorders>
-            <w:shd w:val="clear" w:color="auto" w:fill="FFFFFF"/>
+              <w:top w:val="none" w:sz="0" w:space="0" w:color="000000" w:themeColor="text1"/>
+              <w:left w:val="none" w:sz="0" w:space="0" w:color="000000" w:themeColor="text1"/>
+              <w:bottom w:val="none" w:sz="0" w:space="0" w:color="000000" w:themeColor="text1"/>
+              <w:right w:val="none" w:sz="0" w:space="0" w:color="000000" w:themeColor="text1"/>
+            </w:tcBorders>
+            <w:shd w:val="clear" w:color="auto" w:fill="FFFFFF" w:themeFill="background1"/>
             <w:tcMar>
               <w:top w:w="0" w:type="dxa"/>
               <w:left w:w="0" w:type="dxa"/>
@@ -1934,12 +1968,12 @@
           <w:tcPr>
             <w:tcW w:w="1368" w:type="dxa"/>
             <w:tcBorders>
-              <w:top w:val="none" w:sz="0" w:space="0" w:color="000000"/>
-              <w:left w:val="none" w:sz="0" w:space="0" w:color="000000"/>
-              <w:bottom w:val="none" w:sz="0" w:space="0" w:color="000000"/>
-              <w:right w:val="none" w:sz="0" w:space="0" w:color="000000"/>
-            </w:tcBorders>
-            <w:shd w:val="clear" w:color="auto" w:fill="FFFFFF"/>
+              <w:top w:val="none" w:sz="0" w:space="0" w:color="000000" w:themeColor="text1"/>
+              <w:left w:val="none" w:sz="0" w:space="0" w:color="000000" w:themeColor="text1"/>
+              <w:bottom w:val="none" w:sz="0" w:space="0" w:color="000000" w:themeColor="text1"/>
+              <w:right w:val="none" w:sz="0" w:space="0" w:color="000000" w:themeColor="text1"/>
+            </w:tcBorders>
+            <w:shd w:val="clear" w:color="auto" w:fill="FFFFFF" w:themeFill="background1"/>
             <w:tcMar>
               <w:top w:w="0" w:type="dxa"/>
               <w:left w:w="0" w:type="dxa"/>
@@ -1973,7 +2007,7 @@
                 <w:sz w:val="18"/>
                 <w:szCs w:val="18"/>
               </w:rPr>
-              <w:t>872.7</w:t>
+              <w:t>875.6</w:t>
             </w:r>
           </w:p>
         </w:tc>
@@ -1981,12 +2015,12 @@
           <w:tcPr>
             <w:tcW w:w="1368" w:type="dxa"/>
             <w:tcBorders>
-              <w:top w:val="none" w:sz="0" w:space="0" w:color="000000"/>
-              <w:left w:val="none" w:sz="0" w:space="0" w:color="000000"/>
-              <w:bottom w:val="none" w:sz="0" w:space="0" w:color="000000"/>
-              <w:right w:val="none" w:sz="0" w:space="0" w:color="000000"/>
-            </w:tcBorders>
-            <w:shd w:val="clear" w:color="auto" w:fill="FFFFFF"/>
+              <w:top w:val="none" w:sz="0" w:space="0" w:color="000000" w:themeColor="text1"/>
+              <w:left w:val="none" w:sz="0" w:space="0" w:color="000000" w:themeColor="text1"/>
+              <w:bottom w:val="none" w:sz="0" w:space="0" w:color="000000" w:themeColor="text1"/>
+              <w:right w:val="none" w:sz="0" w:space="0" w:color="000000" w:themeColor="text1"/>
+            </w:tcBorders>
+            <w:shd w:val="clear" w:color="auto" w:fill="FFFFFF" w:themeFill="background1"/>
             <w:tcMar>
               <w:top w:w="0" w:type="dxa"/>
               <w:left w:w="0" w:type="dxa"/>
@@ -2020,7 +2054,7 @@
                 <w:sz w:val="18"/>
                 <w:szCs w:val="18"/>
               </w:rPr>
-              <w:t>33.3%</w:t>
+              <w:t>33.4%</w:t>
             </w:r>
           </w:p>
         </w:tc>
@@ -2033,12 +2067,12 @@
           <w:tcPr>
             <w:tcW w:w="3600" w:type="dxa"/>
             <w:tcBorders>
-              <w:top w:val="none" w:sz="0" w:space="0" w:color="000000"/>
-              <w:left w:val="none" w:sz="0" w:space="0" w:color="000000"/>
-              <w:bottom w:val="none" w:sz="0" w:space="0" w:color="000000"/>
-              <w:right w:val="none" w:sz="0" w:space="0" w:color="000000"/>
-            </w:tcBorders>
-            <w:shd w:val="clear" w:color="auto" w:fill="FFFFFF"/>
+              <w:top w:val="none" w:sz="0" w:space="0" w:color="000000" w:themeColor="text1"/>
+              <w:left w:val="none" w:sz="0" w:space="0" w:color="000000" w:themeColor="text1"/>
+              <w:bottom w:val="none" w:sz="0" w:space="0" w:color="000000" w:themeColor="text1"/>
+              <w:right w:val="none" w:sz="0" w:space="0" w:color="000000" w:themeColor="text1"/>
+            </w:tcBorders>
+            <w:shd w:val="clear" w:color="auto" w:fill="FFFFFF" w:themeFill="background1"/>
             <w:tcMar>
               <w:top w:w="0" w:type="dxa"/>
               <w:left w:w="0" w:type="dxa"/>
@@ -2079,12 +2113,12 @@
           <w:tcPr>
             <w:tcW w:w="1368" w:type="dxa"/>
             <w:tcBorders>
-              <w:top w:val="none" w:sz="0" w:space="0" w:color="000000"/>
-              <w:left w:val="none" w:sz="0" w:space="0" w:color="000000"/>
-              <w:bottom w:val="none" w:sz="0" w:space="0" w:color="000000"/>
-              <w:right w:val="none" w:sz="0" w:space="0" w:color="000000"/>
-            </w:tcBorders>
-            <w:shd w:val="clear" w:color="auto" w:fill="FFFFFF"/>
+              <w:top w:val="none" w:sz="0" w:space="0" w:color="000000" w:themeColor="text1"/>
+              <w:left w:val="none" w:sz="0" w:space="0" w:color="000000" w:themeColor="text1"/>
+              <w:bottom w:val="none" w:sz="0" w:space="0" w:color="000000" w:themeColor="text1"/>
+              <w:right w:val="none" w:sz="0" w:space="0" w:color="000000" w:themeColor="text1"/>
+            </w:tcBorders>
+            <w:shd w:val="clear" w:color="auto" w:fill="FFFFFF" w:themeFill="background1"/>
             <w:tcMar>
               <w:top w:w="0" w:type="dxa"/>
               <w:left w:w="0" w:type="dxa"/>
@@ -2125,12 +2159,12 @@
           <w:tcPr>
             <w:tcW w:w="1368" w:type="dxa"/>
             <w:tcBorders>
-              <w:top w:val="none" w:sz="0" w:space="0" w:color="000000"/>
-              <w:left w:val="none" w:sz="0" w:space="0" w:color="000000"/>
-              <w:bottom w:val="none" w:sz="0" w:space="0" w:color="000000"/>
-              <w:right w:val="none" w:sz="0" w:space="0" w:color="000000"/>
-            </w:tcBorders>
-            <w:shd w:val="clear" w:color="auto" w:fill="FFFFFF"/>
+              <w:top w:val="none" w:sz="0" w:space="0" w:color="000000" w:themeColor="text1"/>
+              <w:left w:val="none" w:sz="0" w:space="0" w:color="000000" w:themeColor="text1"/>
+              <w:bottom w:val="none" w:sz="0" w:space="0" w:color="000000" w:themeColor="text1"/>
+              <w:right w:val="none" w:sz="0" w:space="0" w:color="000000" w:themeColor="text1"/>
+            </w:tcBorders>
+            <w:shd w:val="clear" w:color="auto" w:fill="FFFFFF" w:themeFill="background1"/>
             <w:tcMar>
               <w:top w:w="0" w:type="dxa"/>
               <w:left w:w="0" w:type="dxa"/>
@@ -2172,12 +2206,12 @@
           <w:tcPr>
             <w:tcW w:w="1368" w:type="dxa"/>
             <w:tcBorders>
-              <w:top w:val="none" w:sz="0" w:space="0" w:color="000000"/>
-              <w:left w:val="none" w:sz="0" w:space="0" w:color="000000"/>
-              <w:bottom w:val="none" w:sz="0" w:space="0" w:color="000000"/>
-              <w:right w:val="none" w:sz="0" w:space="0" w:color="000000"/>
-            </w:tcBorders>
-            <w:shd w:val="clear" w:color="auto" w:fill="FFFFFF"/>
+              <w:top w:val="none" w:sz="0" w:space="0" w:color="000000" w:themeColor="text1"/>
+              <w:left w:val="none" w:sz="0" w:space="0" w:color="000000" w:themeColor="text1"/>
+              <w:bottom w:val="none" w:sz="0" w:space="0" w:color="000000" w:themeColor="text1"/>
+              <w:right w:val="none" w:sz="0" w:space="0" w:color="000000" w:themeColor="text1"/>
+            </w:tcBorders>
+            <w:shd w:val="clear" w:color="auto" w:fill="FFFFFF" w:themeFill="background1"/>
             <w:tcMar>
               <w:top w:w="0" w:type="dxa"/>
               <w:left w:w="0" w:type="dxa"/>
@@ -2219,12 +2253,12 @@
           <w:tcPr>
             <w:tcW w:w="1368" w:type="dxa"/>
             <w:tcBorders>
-              <w:top w:val="none" w:sz="0" w:space="0" w:color="000000"/>
-              <w:left w:val="none" w:sz="0" w:space="0" w:color="000000"/>
-              <w:bottom w:val="none" w:sz="0" w:space="0" w:color="000000"/>
-              <w:right w:val="none" w:sz="0" w:space="0" w:color="000000"/>
-            </w:tcBorders>
-            <w:shd w:val="clear" w:color="auto" w:fill="FFFFFF"/>
+              <w:top w:val="none" w:sz="0" w:space="0" w:color="000000" w:themeColor="text1"/>
+              <w:left w:val="none" w:sz="0" w:space="0" w:color="000000" w:themeColor="text1"/>
+              <w:bottom w:val="none" w:sz="0" w:space="0" w:color="000000" w:themeColor="text1"/>
+              <w:right w:val="none" w:sz="0" w:space="0" w:color="000000" w:themeColor="text1"/>
+            </w:tcBorders>
+            <w:shd w:val="clear" w:color="auto" w:fill="FFFFFF" w:themeFill="background1"/>
             <w:tcMar>
               <w:top w:w="0" w:type="dxa"/>
               <w:left w:w="0" w:type="dxa"/>
@@ -2266,12 +2300,12 @@
           <w:tcPr>
             <w:tcW w:w="1368" w:type="dxa"/>
             <w:tcBorders>
-              <w:top w:val="none" w:sz="0" w:space="0" w:color="000000"/>
-              <w:left w:val="none" w:sz="0" w:space="0" w:color="000000"/>
-              <w:bottom w:val="none" w:sz="0" w:space="0" w:color="000000"/>
-              <w:right w:val="none" w:sz="0" w:space="0" w:color="000000"/>
-            </w:tcBorders>
-            <w:shd w:val="clear" w:color="auto" w:fill="FFFFFF"/>
+              <w:top w:val="none" w:sz="0" w:space="0" w:color="000000" w:themeColor="text1"/>
+              <w:left w:val="none" w:sz="0" w:space="0" w:color="000000" w:themeColor="text1"/>
+              <w:bottom w:val="none" w:sz="0" w:space="0" w:color="000000" w:themeColor="text1"/>
+              <w:right w:val="none" w:sz="0" w:space="0" w:color="000000" w:themeColor="text1"/>
+            </w:tcBorders>
+            <w:shd w:val="clear" w:color="auto" w:fill="FFFFFF" w:themeFill="background1"/>
             <w:tcMar>
               <w:top w:w="0" w:type="dxa"/>
               <w:left w:w="0" w:type="dxa"/>
@@ -2313,12 +2347,12 @@
           <w:tcPr>
             <w:tcW w:w="1368" w:type="dxa"/>
             <w:tcBorders>
-              <w:top w:val="none" w:sz="0" w:space="0" w:color="000000"/>
-              <w:left w:val="none" w:sz="0" w:space="0" w:color="000000"/>
-              <w:bottom w:val="none" w:sz="0" w:space="0" w:color="000000"/>
-              <w:right w:val="none" w:sz="0" w:space="0" w:color="000000"/>
-            </w:tcBorders>
-            <w:shd w:val="clear" w:color="auto" w:fill="FFFFFF"/>
+              <w:top w:val="none" w:sz="0" w:space="0" w:color="000000" w:themeColor="text1"/>
+              <w:left w:val="none" w:sz="0" w:space="0" w:color="000000" w:themeColor="text1"/>
+              <w:bottom w:val="none" w:sz="0" w:space="0" w:color="000000" w:themeColor="text1"/>
+              <w:right w:val="none" w:sz="0" w:space="0" w:color="000000" w:themeColor="text1"/>
+            </w:tcBorders>
+            <w:shd w:val="clear" w:color="auto" w:fill="FFFFFF" w:themeFill="background1"/>
             <w:tcMar>
               <w:top w:w="0" w:type="dxa"/>
               <w:left w:w="0" w:type="dxa"/>
@@ -2352,7 +2386,7 @@
                 <w:sz w:val="18"/>
                 <w:szCs w:val="18"/>
               </w:rPr>
-              <w:t>648.6</w:t>
+              <w:t>651.5</w:t>
             </w:r>
           </w:p>
         </w:tc>
@@ -2360,12 +2394,12 @@
           <w:tcPr>
             <w:tcW w:w="1368" w:type="dxa"/>
             <w:tcBorders>
-              <w:top w:val="none" w:sz="0" w:space="0" w:color="000000"/>
-              <w:left w:val="none" w:sz="0" w:space="0" w:color="000000"/>
-              <w:bottom w:val="none" w:sz="0" w:space="0" w:color="000000"/>
-              <w:right w:val="none" w:sz="0" w:space="0" w:color="000000"/>
-            </w:tcBorders>
-            <w:shd w:val="clear" w:color="auto" w:fill="FFFFFF"/>
+              <w:top w:val="none" w:sz="0" w:space="0" w:color="000000" w:themeColor="text1"/>
+              <w:left w:val="none" w:sz="0" w:space="0" w:color="000000" w:themeColor="text1"/>
+              <w:bottom w:val="none" w:sz="0" w:space="0" w:color="000000" w:themeColor="text1"/>
+              <w:right w:val="none" w:sz="0" w:space="0" w:color="000000" w:themeColor="text1"/>
+            </w:tcBorders>
+            <w:shd w:val="clear" w:color="auto" w:fill="FFFFFF" w:themeFill="background1"/>
             <w:tcMar>
               <w:top w:w="0" w:type="dxa"/>
               <w:left w:w="0" w:type="dxa"/>
@@ -2399,7 +2433,7 @@
                 <w:sz w:val="18"/>
                 <w:szCs w:val="18"/>
               </w:rPr>
-              <w:t>38.8%</w:t>
+              <w:t>39%</w:t>
             </w:r>
           </w:p>
         </w:tc>
@@ -2412,12 +2446,12 @@
           <w:tcPr>
             <w:tcW w:w="3600" w:type="dxa"/>
             <w:tcBorders>
-              <w:top w:val="none" w:sz="0" w:space="0" w:color="000000"/>
-              <w:left w:val="none" w:sz="0" w:space="0" w:color="000000"/>
-              <w:bottom w:val="none" w:sz="0" w:space="0" w:color="000000"/>
-              <w:right w:val="none" w:sz="0" w:space="0" w:color="000000"/>
-            </w:tcBorders>
-            <w:shd w:val="clear" w:color="auto" w:fill="FFFFFF"/>
+              <w:top w:val="none" w:sz="0" w:space="0" w:color="000000" w:themeColor="text1"/>
+              <w:left w:val="none" w:sz="0" w:space="0" w:color="000000" w:themeColor="text1"/>
+              <w:bottom w:val="none" w:sz="0" w:space="0" w:color="000000" w:themeColor="text1"/>
+              <w:right w:val="none" w:sz="0" w:space="0" w:color="000000" w:themeColor="text1"/>
+            </w:tcBorders>
+            <w:shd w:val="clear" w:color="auto" w:fill="FFFFFF" w:themeFill="background1"/>
             <w:tcMar>
               <w:top w:w="0" w:type="dxa"/>
               <w:left w:w="0" w:type="dxa"/>
@@ -2458,12 +2492,12 @@
           <w:tcPr>
             <w:tcW w:w="1368" w:type="dxa"/>
             <w:tcBorders>
-              <w:top w:val="none" w:sz="0" w:space="0" w:color="000000"/>
-              <w:left w:val="none" w:sz="0" w:space="0" w:color="000000"/>
-              <w:bottom w:val="none" w:sz="0" w:space="0" w:color="000000"/>
-              <w:right w:val="none" w:sz="0" w:space="0" w:color="000000"/>
-            </w:tcBorders>
-            <w:shd w:val="clear" w:color="auto" w:fill="FFFFFF"/>
+              <w:top w:val="none" w:sz="0" w:space="0" w:color="000000" w:themeColor="text1"/>
+              <w:left w:val="none" w:sz="0" w:space="0" w:color="000000" w:themeColor="text1"/>
+              <w:bottom w:val="none" w:sz="0" w:space="0" w:color="000000" w:themeColor="text1"/>
+              <w:right w:val="none" w:sz="0" w:space="0" w:color="000000" w:themeColor="text1"/>
+            </w:tcBorders>
+            <w:shd w:val="clear" w:color="auto" w:fill="FFFFFF" w:themeFill="background1"/>
             <w:tcMar>
               <w:top w:w="0" w:type="dxa"/>
               <w:left w:w="0" w:type="dxa"/>
@@ -2504,12 +2538,12 @@
           <w:tcPr>
             <w:tcW w:w="1368" w:type="dxa"/>
             <w:tcBorders>
-              <w:top w:val="none" w:sz="0" w:space="0" w:color="000000"/>
-              <w:left w:val="none" w:sz="0" w:space="0" w:color="000000"/>
-              <w:bottom w:val="none" w:sz="0" w:space="0" w:color="000000"/>
-              <w:right w:val="none" w:sz="0" w:space="0" w:color="000000"/>
-            </w:tcBorders>
-            <w:shd w:val="clear" w:color="auto" w:fill="FFFFFF"/>
+              <w:top w:val="none" w:sz="0" w:space="0" w:color="000000" w:themeColor="text1"/>
+              <w:left w:val="none" w:sz="0" w:space="0" w:color="000000" w:themeColor="text1"/>
+              <w:bottom w:val="none" w:sz="0" w:space="0" w:color="000000" w:themeColor="text1"/>
+              <w:right w:val="none" w:sz="0" w:space="0" w:color="000000" w:themeColor="text1"/>
+            </w:tcBorders>
+            <w:shd w:val="clear" w:color="auto" w:fill="FFFFFF" w:themeFill="background1"/>
             <w:tcMar>
               <w:top w:w="0" w:type="dxa"/>
               <w:left w:w="0" w:type="dxa"/>
@@ -2551,12 +2585,12 @@
           <w:tcPr>
             <w:tcW w:w="1368" w:type="dxa"/>
             <w:tcBorders>
-              <w:top w:val="none" w:sz="0" w:space="0" w:color="000000"/>
-              <w:left w:val="none" w:sz="0" w:space="0" w:color="000000"/>
-              <w:bottom w:val="none" w:sz="0" w:space="0" w:color="000000"/>
-              <w:right w:val="none" w:sz="0" w:space="0" w:color="000000"/>
-            </w:tcBorders>
-            <w:shd w:val="clear" w:color="auto" w:fill="FFFFFF"/>
+              <w:top w:val="none" w:sz="0" w:space="0" w:color="000000" w:themeColor="text1"/>
+              <w:left w:val="none" w:sz="0" w:space="0" w:color="000000" w:themeColor="text1"/>
+              <w:bottom w:val="none" w:sz="0" w:space="0" w:color="000000" w:themeColor="text1"/>
+              <w:right w:val="none" w:sz="0" w:space="0" w:color="000000" w:themeColor="text1"/>
+            </w:tcBorders>
+            <w:shd w:val="clear" w:color="auto" w:fill="FFFFFF" w:themeFill="background1"/>
             <w:tcMar>
               <w:top w:w="0" w:type="dxa"/>
               <w:left w:w="0" w:type="dxa"/>
@@ -2598,12 +2632,12 @@
           <w:tcPr>
             <w:tcW w:w="1368" w:type="dxa"/>
             <w:tcBorders>
-              <w:top w:val="none" w:sz="0" w:space="0" w:color="000000"/>
-              <w:left w:val="none" w:sz="0" w:space="0" w:color="000000"/>
-              <w:bottom w:val="none" w:sz="0" w:space="0" w:color="000000"/>
-              <w:right w:val="none" w:sz="0" w:space="0" w:color="000000"/>
-            </w:tcBorders>
-            <w:shd w:val="clear" w:color="auto" w:fill="FFFFFF"/>
+              <w:top w:val="none" w:sz="0" w:space="0" w:color="000000" w:themeColor="text1"/>
+              <w:left w:val="none" w:sz="0" w:space="0" w:color="000000" w:themeColor="text1"/>
+              <w:bottom w:val="none" w:sz="0" w:space="0" w:color="000000" w:themeColor="text1"/>
+              <w:right w:val="none" w:sz="0" w:space="0" w:color="000000" w:themeColor="text1"/>
+            </w:tcBorders>
+            <w:shd w:val="clear" w:color="auto" w:fill="FFFFFF" w:themeFill="background1"/>
             <w:tcMar>
               <w:top w:w="0" w:type="dxa"/>
               <w:left w:w="0" w:type="dxa"/>
@@ -2645,12 +2679,12 @@
           <w:tcPr>
             <w:tcW w:w="1368" w:type="dxa"/>
             <w:tcBorders>
-              <w:top w:val="none" w:sz="0" w:space="0" w:color="000000"/>
-              <w:left w:val="none" w:sz="0" w:space="0" w:color="000000"/>
-              <w:bottom w:val="none" w:sz="0" w:space="0" w:color="000000"/>
-              <w:right w:val="none" w:sz="0" w:space="0" w:color="000000"/>
-            </w:tcBorders>
-            <w:shd w:val="clear" w:color="auto" w:fill="FFFFFF"/>
+              <w:top w:val="none" w:sz="0" w:space="0" w:color="000000" w:themeColor="text1"/>
+              <w:left w:val="none" w:sz="0" w:space="0" w:color="000000" w:themeColor="text1"/>
+              <w:bottom w:val="none" w:sz="0" w:space="0" w:color="000000" w:themeColor="text1"/>
+              <w:right w:val="none" w:sz="0" w:space="0" w:color="000000" w:themeColor="text1"/>
+            </w:tcBorders>
+            <w:shd w:val="clear" w:color="auto" w:fill="FFFFFF" w:themeFill="background1"/>
             <w:tcMar>
               <w:top w:w="0" w:type="dxa"/>
               <w:left w:w="0" w:type="dxa"/>
@@ -2692,12 +2726,12 @@
           <w:tcPr>
             <w:tcW w:w="1368" w:type="dxa"/>
             <w:tcBorders>
-              <w:top w:val="none" w:sz="0" w:space="0" w:color="000000"/>
-              <w:left w:val="none" w:sz="0" w:space="0" w:color="000000"/>
-              <w:bottom w:val="none" w:sz="0" w:space="0" w:color="000000"/>
-              <w:right w:val="none" w:sz="0" w:space="0" w:color="000000"/>
-            </w:tcBorders>
-            <w:shd w:val="clear" w:color="auto" w:fill="FFFFFF"/>
+              <w:top w:val="none" w:sz="0" w:space="0" w:color="000000" w:themeColor="text1"/>
+              <w:left w:val="none" w:sz="0" w:space="0" w:color="000000" w:themeColor="text1"/>
+              <w:bottom w:val="none" w:sz="0" w:space="0" w:color="000000" w:themeColor="text1"/>
+              <w:right w:val="none" w:sz="0" w:space="0" w:color="000000" w:themeColor="text1"/>
+            </w:tcBorders>
+            <w:shd w:val="clear" w:color="auto" w:fill="FFFFFF" w:themeFill="background1"/>
             <w:tcMar>
               <w:top w:w="0" w:type="dxa"/>
               <w:left w:w="0" w:type="dxa"/>
@@ -2731,7 +2765,7 @@
                 <w:sz w:val="18"/>
                 <w:szCs w:val="18"/>
               </w:rPr>
-              <w:t>648.6</w:t>
+              <w:t>651.5</w:t>
             </w:r>
           </w:p>
         </w:tc>
@@ -2739,12 +2773,12 @@
           <w:tcPr>
             <w:tcW w:w="1368" w:type="dxa"/>
             <w:tcBorders>
-              <w:top w:val="none" w:sz="0" w:space="0" w:color="000000"/>
-              <w:left w:val="none" w:sz="0" w:space="0" w:color="000000"/>
-              <w:bottom w:val="none" w:sz="0" w:space="0" w:color="000000"/>
-              <w:right w:val="none" w:sz="0" w:space="0" w:color="000000"/>
-            </w:tcBorders>
-            <w:shd w:val="clear" w:color="auto" w:fill="FFFFFF"/>
+              <w:top w:val="none" w:sz="0" w:space="0" w:color="000000" w:themeColor="text1"/>
+              <w:left w:val="none" w:sz="0" w:space="0" w:color="000000" w:themeColor="text1"/>
+              <w:bottom w:val="none" w:sz="0" w:space="0" w:color="000000" w:themeColor="text1"/>
+              <w:right w:val="none" w:sz="0" w:space="0" w:color="000000" w:themeColor="text1"/>
+            </w:tcBorders>
+            <w:shd w:val="clear" w:color="auto" w:fill="FFFFFF" w:themeFill="background1"/>
             <w:tcMar>
               <w:top w:w="0" w:type="dxa"/>
               <w:left w:w="0" w:type="dxa"/>
@@ -2778,7 +2812,7 @@
                 <w:sz w:val="18"/>
                 <w:szCs w:val="18"/>
               </w:rPr>
-              <w:t>32.5%</w:t>
+              <w:t>32.7%</w:t>
             </w:r>
           </w:p>
         </w:tc>
@@ -2791,12 +2825,12 @@
           <w:tcPr>
             <w:tcW w:w="3600" w:type="dxa"/>
             <w:tcBorders>
-              <w:top w:val="none" w:sz="0" w:space="0" w:color="000000"/>
-              <w:left w:val="none" w:sz="0" w:space="0" w:color="000000"/>
-              <w:bottom w:val="none" w:sz="0" w:space="0" w:color="000000"/>
-              <w:right w:val="none" w:sz="0" w:space="0" w:color="000000"/>
-            </w:tcBorders>
-            <w:shd w:val="clear" w:color="auto" w:fill="FFFFFF"/>
+              <w:top w:val="none" w:sz="0" w:space="0" w:color="000000" w:themeColor="text1"/>
+              <w:left w:val="none" w:sz="0" w:space="0" w:color="000000" w:themeColor="text1"/>
+              <w:bottom w:val="none" w:sz="0" w:space="0" w:color="000000" w:themeColor="text1"/>
+              <w:right w:val="none" w:sz="0" w:space="0" w:color="000000" w:themeColor="text1"/>
+            </w:tcBorders>
+            <w:shd w:val="clear" w:color="auto" w:fill="FFFFFF" w:themeFill="background1"/>
             <w:tcMar>
               <w:top w:w="0" w:type="dxa"/>
               <w:left w:w="0" w:type="dxa"/>
@@ -2837,12 +2871,12 @@
           <w:tcPr>
             <w:tcW w:w="1368" w:type="dxa"/>
             <w:tcBorders>
-              <w:top w:val="none" w:sz="0" w:space="0" w:color="000000"/>
-              <w:left w:val="none" w:sz="0" w:space="0" w:color="000000"/>
-              <w:bottom w:val="none" w:sz="0" w:space="0" w:color="000000"/>
-              <w:right w:val="none" w:sz="0" w:space="0" w:color="000000"/>
-            </w:tcBorders>
-            <w:shd w:val="clear" w:color="auto" w:fill="FFFFFF"/>
+              <w:top w:val="none" w:sz="0" w:space="0" w:color="000000" w:themeColor="text1"/>
+              <w:left w:val="none" w:sz="0" w:space="0" w:color="000000" w:themeColor="text1"/>
+              <w:bottom w:val="none" w:sz="0" w:space="0" w:color="000000" w:themeColor="text1"/>
+              <w:right w:val="none" w:sz="0" w:space="0" w:color="000000" w:themeColor="text1"/>
+            </w:tcBorders>
+            <w:shd w:val="clear" w:color="auto" w:fill="FFFFFF" w:themeFill="background1"/>
             <w:tcMar>
               <w:top w:w="0" w:type="dxa"/>
               <w:left w:w="0" w:type="dxa"/>
@@ -2883,12 +2917,12 @@
           <w:tcPr>
             <w:tcW w:w="1368" w:type="dxa"/>
             <w:tcBorders>
-              <w:top w:val="none" w:sz="0" w:space="0" w:color="000000"/>
-              <w:left w:val="none" w:sz="0" w:space="0" w:color="000000"/>
-              <w:bottom w:val="none" w:sz="0" w:space="0" w:color="000000"/>
-              <w:right w:val="none" w:sz="0" w:space="0" w:color="000000"/>
-            </w:tcBorders>
-            <w:shd w:val="clear" w:color="auto" w:fill="FFFFFF"/>
+              <w:top w:val="none" w:sz="0" w:space="0" w:color="000000" w:themeColor="text1"/>
+              <w:left w:val="none" w:sz="0" w:space="0" w:color="000000" w:themeColor="text1"/>
+              <w:bottom w:val="none" w:sz="0" w:space="0" w:color="000000" w:themeColor="text1"/>
+              <w:right w:val="none" w:sz="0" w:space="0" w:color="000000" w:themeColor="text1"/>
+            </w:tcBorders>
+            <w:shd w:val="clear" w:color="auto" w:fill="FFFFFF" w:themeFill="background1"/>
             <w:tcMar>
               <w:top w:w="0" w:type="dxa"/>
               <w:left w:w="0" w:type="dxa"/>
@@ -2930,12 +2964,12 @@
           <w:tcPr>
             <w:tcW w:w="1368" w:type="dxa"/>
             <w:tcBorders>
-              <w:top w:val="none" w:sz="0" w:space="0" w:color="000000"/>
-              <w:left w:val="none" w:sz="0" w:space="0" w:color="000000"/>
-              <w:bottom w:val="none" w:sz="0" w:space="0" w:color="000000"/>
-              <w:right w:val="none" w:sz="0" w:space="0" w:color="000000"/>
-            </w:tcBorders>
-            <w:shd w:val="clear" w:color="auto" w:fill="FFFFFF"/>
+              <w:top w:val="none" w:sz="0" w:space="0" w:color="000000" w:themeColor="text1"/>
+              <w:left w:val="none" w:sz="0" w:space="0" w:color="000000" w:themeColor="text1"/>
+              <w:bottom w:val="none" w:sz="0" w:space="0" w:color="000000" w:themeColor="text1"/>
+              <w:right w:val="none" w:sz="0" w:space="0" w:color="000000" w:themeColor="text1"/>
+            </w:tcBorders>
+            <w:shd w:val="clear" w:color="auto" w:fill="FFFFFF" w:themeFill="background1"/>
             <w:tcMar>
               <w:top w:w="0" w:type="dxa"/>
               <w:left w:w="0" w:type="dxa"/>
@@ -2977,12 +3011,12 @@
           <w:tcPr>
             <w:tcW w:w="1368" w:type="dxa"/>
             <w:tcBorders>
-              <w:top w:val="none" w:sz="0" w:space="0" w:color="000000"/>
-              <w:left w:val="none" w:sz="0" w:space="0" w:color="000000"/>
-              <w:bottom w:val="none" w:sz="0" w:space="0" w:color="000000"/>
-              <w:right w:val="none" w:sz="0" w:space="0" w:color="000000"/>
-            </w:tcBorders>
-            <w:shd w:val="clear" w:color="auto" w:fill="FFFFFF"/>
+              <w:top w:val="none" w:sz="0" w:space="0" w:color="000000" w:themeColor="text1"/>
+              <w:left w:val="none" w:sz="0" w:space="0" w:color="000000" w:themeColor="text1"/>
+              <w:bottom w:val="none" w:sz="0" w:space="0" w:color="000000" w:themeColor="text1"/>
+              <w:right w:val="none" w:sz="0" w:space="0" w:color="000000" w:themeColor="text1"/>
+            </w:tcBorders>
+            <w:shd w:val="clear" w:color="auto" w:fill="FFFFFF" w:themeFill="background1"/>
             <w:tcMar>
               <w:top w:w="0" w:type="dxa"/>
               <w:left w:w="0" w:type="dxa"/>
@@ -3024,12 +3058,12 @@
           <w:tcPr>
             <w:tcW w:w="1368" w:type="dxa"/>
             <w:tcBorders>
-              <w:top w:val="none" w:sz="0" w:space="0" w:color="000000"/>
-              <w:left w:val="none" w:sz="0" w:space="0" w:color="000000"/>
-              <w:bottom w:val="none" w:sz="0" w:space="0" w:color="000000"/>
-              <w:right w:val="none" w:sz="0" w:space="0" w:color="000000"/>
-            </w:tcBorders>
-            <w:shd w:val="clear" w:color="auto" w:fill="FFFFFF"/>
+              <w:top w:val="none" w:sz="0" w:space="0" w:color="000000" w:themeColor="text1"/>
+              <w:left w:val="none" w:sz="0" w:space="0" w:color="000000" w:themeColor="text1"/>
+              <w:bottom w:val="none" w:sz="0" w:space="0" w:color="000000" w:themeColor="text1"/>
+              <w:right w:val="none" w:sz="0" w:space="0" w:color="000000" w:themeColor="text1"/>
+            </w:tcBorders>
+            <w:shd w:val="clear" w:color="auto" w:fill="FFFFFF" w:themeFill="background1"/>
             <w:tcMar>
               <w:top w:w="0" w:type="dxa"/>
               <w:left w:w="0" w:type="dxa"/>
@@ -3071,12 +3105,12 @@
           <w:tcPr>
             <w:tcW w:w="1368" w:type="dxa"/>
             <w:tcBorders>
-              <w:top w:val="none" w:sz="0" w:space="0" w:color="000000"/>
-              <w:left w:val="none" w:sz="0" w:space="0" w:color="000000"/>
-              <w:bottom w:val="none" w:sz="0" w:space="0" w:color="000000"/>
-              <w:right w:val="none" w:sz="0" w:space="0" w:color="000000"/>
-            </w:tcBorders>
-            <w:shd w:val="clear" w:color="auto" w:fill="FFFFFF"/>
+              <w:top w:val="none" w:sz="0" w:space="0" w:color="000000" w:themeColor="text1"/>
+              <w:left w:val="none" w:sz="0" w:space="0" w:color="000000" w:themeColor="text1"/>
+              <w:bottom w:val="none" w:sz="0" w:space="0" w:color="000000" w:themeColor="text1"/>
+              <w:right w:val="none" w:sz="0" w:space="0" w:color="000000" w:themeColor="text1"/>
+            </w:tcBorders>
+            <w:shd w:val="clear" w:color="auto" w:fill="FFFFFF" w:themeFill="background1"/>
             <w:tcMar>
               <w:top w:w="0" w:type="dxa"/>
               <w:left w:w="0" w:type="dxa"/>
@@ -3118,12 +3152,12 @@
           <w:tcPr>
             <w:tcW w:w="1368" w:type="dxa"/>
             <w:tcBorders>
-              <w:top w:val="none" w:sz="0" w:space="0" w:color="000000"/>
-              <w:left w:val="none" w:sz="0" w:space="0" w:color="000000"/>
-              <w:bottom w:val="none" w:sz="0" w:space="0" w:color="000000"/>
-              <w:right w:val="none" w:sz="0" w:space="0" w:color="000000"/>
-            </w:tcBorders>
-            <w:shd w:val="clear" w:color="auto" w:fill="FFFFFF"/>
+              <w:top w:val="none" w:sz="0" w:space="0" w:color="000000" w:themeColor="text1"/>
+              <w:left w:val="none" w:sz="0" w:space="0" w:color="000000" w:themeColor="text1"/>
+              <w:bottom w:val="none" w:sz="0" w:space="0" w:color="000000" w:themeColor="text1"/>
+              <w:right w:val="none" w:sz="0" w:space="0" w:color="000000" w:themeColor="text1"/>
+            </w:tcBorders>
+            <w:shd w:val="clear" w:color="auto" w:fill="FFFFFF" w:themeFill="background1"/>
             <w:tcMar>
               <w:top w:w="0" w:type="dxa"/>
               <w:left w:w="0" w:type="dxa"/>
@@ -3170,12 +3204,12 @@
           <w:tcPr>
             <w:tcW w:w="3600" w:type="dxa"/>
             <w:tcBorders>
-              <w:top w:val="none" w:sz="0" w:space="0" w:color="000000"/>
-              <w:left w:val="none" w:sz="0" w:space="0" w:color="000000"/>
+              <w:top w:val="none" w:sz="0" w:space="0" w:color="000000" w:themeColor="text1"/>
+              <w:left w:val="none" w:sz="0" w:space="0" w:color="000000" w:themeColor="text1"/>
               <w:bottom w:val="single" w:sz="12" w:space="0" w:color="666666"/>
-              <w:right w:val="none" w:sz="0" w:space="0" w:color="000000"/>
-            </w:tcBorders>
-            <w:shd w:val="clear" w:color="auto" w:fill="FFFFFF"/>
+              <w:right w:val="none" w:sz="0" w:space="0" w:color="000000" w:themeColor="text1"/>
+            </w:tcBorders>
+            <w:shd w:val="clear" w:color="auto" w:fill="FFFFFF" w:themeFill="background1"/>
             <w:tcMar>
               <w:top w:w="0" w:type="dxa"/>
               <w:left w:w="0" w:type="dxa"/>
@@ -3216,12 +3250,12 @@
           <w:tcPr>
             <w:tcW w:w="1368" w:type="dxa"/>
             <w:tcBorders>
-              <w:top w:val="none" w:sz="0" w:space="0" w:color="000000"/>
-              <w:left w:val="none" w:sz="0" w:space="0" w:color="000000"/>
+              <w:top w:val="none" w:sz="0" w:space="0" w:color="000000" w:themeColor="text1"/>
+              <w:left w:val="none" w:sz="0" w:space="0" w:color="000000" w:themeColor="text1"/>
               <w:bottom w:val="single" w:sz="12" w:space="0" w:color="666666"/>
-              <w:right w:val="none" w:sz="0" w:space="0" w:color="000000"/>
-            </w:tcBorders>
-            <w:shd w:val="clear" w:color="auto" w:fill="FFFFFF"/>
+              <w:right w:val="none" w:sz="0" w:space="0" w:color="000000" w:themeColor="text1"/>
+            </w:tcBorders>
+            <w:shd w:val="clear" w:color="auto" w:fill="FFFFFF" w:themeFill="background1"/>
             <w:tcMar>
               <w:top w:w="0" w:type="dxa"/>
               <w:left w:w="0" w:type="dxa"/>
@@ -3262,12 +3296,12 @@
           <w:tcPr>
             <w:tcW w:w="1368" w:type="dxa"/>
             <w:tcBorders>
-              <w:top w:val="none" w:sz="0" w:space="0" w:color="000000"/>
-              <w:left w:val="none" w:sz="0" w:space="0" w:color="000000"/>
+              <w:top w:val="none" w:sz="0" w:space="0" w:color="000000" w:themeColor="text1"/>
+              <w:left w:val="none" w:sz="0" w:space="0" w:color="000000" w:themeColor="text1"/>
               <w:bottom w:val="single" w:sz="12" w:space="0" w:color="666666"/>
-              <w:right w:val="none" w:sz="0" w:space="0" w:color="000000"/>
-            </w:tcBorders>
-            <w:shd w:val="clear" w:color="auto" w:fill="FFFFFF"/>
+              <w:right w:val="none" w:sz="0" w:space="0" w:color="000000" w:themeColor="text1"/>
+            </w:tcBorders>
+            <w:shd w:val="clear" w:color="auto" w:fill="FFFFFF" w:themeFill="background1"/>
             <w:tcMar>
               <w:top w:w="0" w:type="dxa"/>
               <w:left w:w="0" w:type="dxa"/>
@@ -3309,12 +3343,12 @@
           <w:tcPr>
             <w:tcW w:w="1368" w:type="dxa"/>
             <w:tcBorders>
-              <w:top w:val="none" w:sz="0" w:space="0" w:color="000000"/>
-              <w:left w:val="none" w:sz="0" w:space="0" w:color="000000"/>
+              <w:top w:val="none" w:sz="0" w:space="0" w:color="000000" w:themeColor="text1"/>
+              <w:left w:val="none" w:sz="0" w:space="0" w:color="000000" w:themeColor="text1"/>
               <w:bottom w:val="single" w:sz="12" w:space="0" w:color="666666"/>
-              <w:right w:val="none" w:sz="0" w:space="0" w:color="000000"/>
-            </w:tcBorders>
-            <w:shd w:val="clear" w:color="auto" w:fill="FFFFFF"/>
+              <w:right w:val="none" w:sz="0" w:space="0" w:color="000000" w:themeColor="text1"/>
+            </w:tcBorders>
+            <w:shd w:val="clear" w:color="auto" w:fill="FFFFFF" w:themeFill="background1"/>
             <w:tcMar>
               <w:top w:w="0" w:type="dxa"/>
               <w:left w:w="0" w:type="dxa"/>
@@ -3356,12 +3390,12 @@
           <w:tcPr>
             <w:tcW w:w="1368" w:type="dxa"/>
             <w:tcBorders>
-              <w:top w:val="none" w:sz="0" w:space="0" w:color="000000"/>
-              <w:left w:val="none" w:sz="0" w:space="0" w:color="000000"/>
+              <w:top w:val="none" w:sz="0" w:space="0" w:color="000000" w:themeColor="text1"/>
+              <w:left w:val="none" w:sz="0" w:space="0" w:color="000000" w:themeColor="text1"/>
               <w:bottom w:val="single" w:sz="12" w:space="0" w:color="666666"/>
-              <w:right w:val="none" w:sz="0" w:space="0" w:color="000000"/>
-            </w:tcBorders>
-            <w:shd w:val="clear" w:color="auto" w:fill="FFFFFF"/>
+              <w:right w:val="none" w:sz="0" w:space="0" w:color="000000" w:themeColor="text1"/>
+            </w:tcBorders>
+            <w:shd w:val="clear" w:color="auto" w:fill="FFFFFF" w:themeFill="background1"/>
             <w:tcMar>
               <w:top w:w="0" w:type="dxa"/>
               <w:left w:w="0" w:type="dxa"/>
@@ -3403,12 +3437,12 @@
           <w:tcPr>
             <w:tcW w:w="1368" w:type="dxa"/>
             <w:tcBorders>
-              <w:top w:val="none" w:sz="0" w:space="0" w:color="000000"/>
-              <w:left w:val="none" w:sz="0" w:space="0" w:color="000000"/>
+              <w:top w:val="none" w:sz="0" w:space="0" w:color="000000" w:themeColor="text1"/>
+              <w:left w:val="none" w:sz="0" w:space="0" w:color="000000" w:themeColor="text1"/>
               <w:bottom w:val="single" w:sz="12" w:space="0" w:color="666666"/>
-              <w:right w:val="none" w:sz="0" w:space="0" w:color="000000"/>
-            </w:tcBorders>
-            <w:shd w:val="clear" w:color="auto" w:fill="FFFFFF"/>
+              <w:right w:val="none" w:sz="0" w:space="0" w:color="000000" w:themeColor="text1"/>
+            </w:tcBorders>
+            <w:shd w:val="clear" w:color="auto" w:fill="FFFFFF" w:themeFill="background1"/>
             <w:tcMar>
               <w:top w:w="0" w:type="dxa"/>
               <w:left w:w="0" w:type="dxa"/>
@@ -3450,12 +3484,12 @@
           <w:tcPr>
             <w:tcW w:w="1368" w:type="dxa"/>
             <w:tcBorders>
-              <w:top w:val="none" w:sz="0" w:space="0" w:color="000000"/>
-              <w:left w:val="none" w:sz="0" w:space="0" w:color="000000"/>
+              <w:top w:val="none" w:sz="0" w:space="0" w:color="000000" w:themeColor="text1"/>
+              <w:left w:val="none" w:sz="0" w:space="0" w:color="000000" w:themeColor="text1"/>
               <w:bottom w:val="single" w:sz="12" w:space="0" w:color="666666"/>
-              <w:right w:val="none" w:sz="0" w:space="0" w:color="000000"/>
-            </w:tcBorders>
-            <w:shd w:val="clear" w:color="auto" w:fill="FFFFFF"/>
+              <w:right w:val="none" w:sz="0" w:space="0" w:color="000000" w:themeColor="text1"/>
+            </w:tcBorders>
+            <w:shd w:val="clear" w:color="auto" w:fill="FFFFFF" w:themeFill="background1"/>
             <w:tcMar>
               <w:top w:w="0" w:type="dxa"/>
               <w:left w:w="0" w:type="dxa"/>
@@ -3497,12 +3531,12 @@
           <w:tcPr>
             <w:tcW w:w="1368" w:type="dxa"/>
             <w:tcBorders>
-              <w:top w:val="none" w:sz="0" w:space="0" w:color="000000"/>
-              <w:left w:val="none" w:sz="0" w:space="0" w:color="000000"/>
+              <w:top w:val="none" w:sz="0" w:space="0" w:color="000000" w:themeColor="text1"/>
+              <w:left w:val="none" w:sz="0" w:space="0" w:color="000000" w:themeColor="text1"/>
               <w:bottom w:val="single" w:sz="12" w:space="0" w:color="666666"/>
-              <w:right w:val="none" w:sz="0" w:space="0" w:color="000000"/>
-            </w:tcBorders>
-            <w:shd w:val="clear" w:color="auto" w:fill="FFFFFF"/>
+              <w:right w:val="none" w:sz="0" w:space="0" w:color="000000" w:themeColor="text1"/>
+            </w:tcBorders>
+            <w:shd w:val="clear" w:color="auto" w:fill="FFFFFF" w:themeFill="background1"/>
             <w:tcMar>
               <w:top w:w="0" w:type="dxa"/>
               <w:left w:w="0" w:type="dxa"/>
@@ -3542,24 +3576,13 @@
         </w:tc>
       </w:tr>
     </w:tbl>
-    <w:p/>
-    <w:p>
-      <w:pPr>
-        <w:rPr>
-          <w:rFonts w:asciiTheme="majorHAnsi" w:eastAsiaTheme="majorEastAsia" w:hAnsiTheme="majorHAnsi" w:cstheme="majorBidi"/>
-          <w:b/>
-          <w:bCs/>
-          <w:sz w:val="26"/>
-          <w:szCs w:val="26"/>
-        </w:rPr>
-      </w:pPr>
-      <w:r>
-        <w:br w:type="page"/>
-      </w:r>
-    </w:p>
     <w:p>
       <w:pPr>
         <w:pStyle w:val="Heading2"/>
+        <w:numPr>
+          <w:ilvl w:val="0"/>
+          <w:numId w:val="0"/>
+        </w:numPr>
         <w:sectPr>
           <w:type w:val="continuous"/>
           <w:pgSz w:w="16840" w:h="11900" w:orient="landscape"/>
@@ -3628,31 +3651,93 @@
     </w:p>
     <w:p>
       <w:r>
-        <w:t>The Biological Opinion states: 'The JPE for each release group of salmonids entering the Delta shall be determined by the historical average survival from release sites to Delta entry, or when available, by observed survival to Delta entry provided by real-time acoustic receiver arrays.'</w:t>
+        <w:t xml:space="preserve">The </w:t>
+      </w:r>
+      <w:r>
+        <w:t>Proposed Action</w:t>
+      </w:r>
+      <w:r>
+        <w:t xml:space="preserve"> states: 'The JPE for each release group of salmonids entering the Delta shall be determined by the historical average survival from release sites to Delta entry, or when available, by observed survival to Delta entry provided by real-time acoustic receiver arrays.'</w:t>
       </w:r>
     </w:p>
     <w:p/>
     <w:p>
       <w:r>
-        <w:t>Based on this language emphasizing 'historical average survival,' the recommended method is:</w:t>
+        <w:t>Based on this language and current practice, the recommended method is:</w:t>
       </w:r>
     </w:p>
     <w:p/>
     <w:p>
       <w:r>
-        <w:t>Scenario 2: All Releases + Historical Mean (Historical Years Only) = 32.6%</w:t>
+        <w:t>Scenario 1: All Releases + Historical Mean (All Years) = 27.3%</w:t>
       </w:r>
     </w:p>
     <w:p/>
     <w:p>
       <w:r>
-        <w:t>This approach: (1) aligns with the regulatory language to use historical averages, (2) uses only the years in sr_hatchery_survival.csv that represent historical baseline (2019-2021), (3) excludes the current year 2026 which is still being observed, and (4) matches the original calculation approach used in previous analyses.</w:t>
+        <w:t>This approach: (1) aligns with the regulatory language to use historical averages, (2) uses all available years in sr_hatchery_survival.csv (2019-2021, 2026), (3) includes both historical baseline and current year observations, and (4) provides the most comprehensive survival estimate from available telemetry data.</w:t>
       </w:r>
     </w:p>
     <w:p/>
     <w:p>
       <w:r>
-        <w:t>Alternative: Scenario 1 (All Years average = 27.3%) could be used for a more conservative approach that includes the current year's estimate.</w:t>
+        <w:t>Alternative: Scenario 2 (Historical Years Only = 32.6%) excludes the current year 2026 and uses only the historical baseline (2019-2021).</w:t>
+      </w:r>
+    </w:p>
+    <w:p/>
+    <w:p>
+      <w:pPr>
+        <w:pStyle w:val="Heading2"/>
+      </w:pPr>
+      <w:r>
+        <w:t>Summary for Weekly Assessment</w:t>
+      </w:r>
+    </w:p>
+    <w:p>
+      <w:r>
+        <w:t xml:space="preserve">Spring-Run Chinook Salmon Surrogate Releases (WY2026): </w:t>
+      </w:r>
+      <w:r>
+        <w:t xml:space="preserve">The </w:t>
+      </w:r>
+      <w:r>
+        <w:t>total Coleman Late-Fall Chinook salmon</w:t>
+      </w:r>
+      <w:r>
+        <w:t xml:space="preserve"> production</w:t>
+      </w:r>
+      <w:r>
+        <w:t xml:space="preserve"> </w:t>
+      </w:r>
+      <w:r>
+        <w:t>(yearling surrogates)</w:t>
+      </w:r>
+      <w:r>
+        <w:t xml:space="preserve"> was 805,323, which </w:t>
+      </w:r>
+      <w:r>
+        <w:t xml:space="preserve">were </w:t>
+      </w:r>
+      <w:r>
+        <w:t xml:space="preserve">released </w:t>
+      </w:r>
+      <w:r>
+        <w:t xml:space="preserve">as </w:t>
+      </w:r>
+      <w:r>
+        <w:t>production and experimental groups.</w:t>
+      </w:r>
+      <w:r>
+        <w:t xml:space="preserve"> </w:t>
+      </w:r>
+      <w:r>
+        <w:t xml:space="preserve"> Using the historical average survival rate (27.3% from all available years 2019-2021, 2026), the Juvenile Production Estimate (JPE) entering the Delta is approximately 219,853 fish. The annual loss threshold for spring-run surrogates is 1% of the JPE, which equals 2,199 fish. As of [INSERT DATE], cumulative loss is 875.6 fish or 39.8% of the annual loss threshold. JPE Calculation Method: Historical average survival (27.3%) applied to all Coleman Late-Fall releases (both production and experimental), consistent with </w:t>
+      </w:r>
+      <w:r>
+        <w:t>Proposed Action</w:t>
+      </w:r>
+      <w:r>
+        <w:t xml:space="preserve"> requirements to track spring-run loss using Coleman Late-Fall as yearling surrogates.</w:t>
       </w:r>
     </w:p>
     <w:sectPr>
@@ -3928,13 +4013,13 @@
       </w:pPr>
     </w:lvl>
   </w:abstractNum>
-  <w:num w:numId="1" w16cid:durableId="370149196">
+  <w:num w:numId="1" w16cid:durableId="1772554969">
     <w:abstractNumId w:val="1"/>
   </w:num>
-  <w:num w:numId="2" w16cid:durableId="665594733">
+  <w:num w:numId="2" w16cid:durableId="2038774255">
     <w:abstractNumId w:val="2"/>
   </w:num>
-  <w:num w:numId="3" w16cid:durableId="1329944662">
+  <w:num w:numId="3" w16cid:durableId="1564633795">
     <w:abstractNumId w:val="0"/>
   </w:num>
 </w:numbering>
@@ -4360,7 +4445,6 @@
     <w:next w:val="Normal"/>
     <w:link w:val="Heading2Char"/>
     <w:uiPriority w:val="9"/>
-    <w:semiHidden/>
     <w:unhideWhenUsed/>
     <w:qFormat/>
     <w:rsid w:val="00362E65"/>
@@ -4462,34 +4546,11 @@
     <w:pPr>
       <w:jc w:val="right"/>
     </w:pPr>
-    <w:tblPr>
-      <w:jc w:val="center"/>
-      <w:tblBorders>
-        <w:top w:val="single" w:sz="8" w:space="0" w:color="auto"/>
-        <w:bottom w:val="single" w:sz="8" w:space="0" w:color="auto"/>
-        <w:insideH w:val="single" w:sz="8" w:space="0" w:color="auto"/>
-      </w:tblBorders>
-    </w:tblPr>
-    <w:trPr>
-      <w:jc w:val="center"/>
-    </w:trPr>
+    <w:tblPr/>
     <w:tblStylePr w:type="firstRow">
       <w:rPr>
         <w:b/>
       </w:rPr>
-      <w:tblPr/>
-      <w:tcPr>
-        <w:tcBorders>
-          <w:top w:val="nil"/>
-          <w:left w:val="nil"/>
-          <w:bottom w:val="single" w:sz="18" w:space="0" w:color="auto"/>
-          <w:right w:val="nil"/>
-          <w:insideH w:val="nil"/>
-          <w:insideV w:val="nil"/>
-          <w:tl2br w:val="nil"/>
-          <w:tr2bl w:val="nil"/>
-        </w:tcBorders>
-      </w:tcPr>
     </w:tblStylePr>
   </w:style>
   <w:style w:type="table" w:styleId="LightList-Accent2">
@@ -4593,7 +4654,6 @@
     <w:basedOn w:val="DefaultParagraphFont"/>
     <w:link w:val="Heading2"/>
     <w:uiPriority w:val="9"/>
-    <w:semiHidden/>
     <w:rsid w:val="00362E65"/>
     <w:rPr>
       <w:rFonts w:asciiTheme="majorHAnsi" w:eastAsiaTheme="majorEastAsia" w:hAnsiTheme="majorHAnsi" w:cstheme="majorBidi"/>
@@ -4739,6 +4799,76 @@
     <w:basedOn w:val="TableCaption"/>
     <w:next w:val="Normal"/>
     <w:rsid w:val="00901463"/>
+  </w:style>
+  <w:style w:type="paragraph" w:styleId="Revision">
+    <w:name w:val="Revision"/>
+    <w:hidden/>
+    <w:uiPriority w:val="99"/>
+    <w:semiHidden/>
+    <w:rsid w:val="00C10B93"/>
+  </w:style>
+  <w:style w:type="character" w:styleId="CommentReference">
+    <w:name w:val="annotation reference"/>
+    <w:basedOn w:val="DefaultParagraphFont"/>
+    <w:uiPriority w:val="99"/>
+    <w:semiHidden/>
+    <w:unhideWhenUsed/>
+    <w:rsid w:val="00AA3A9B"/>
+    <w:rPr>
+      <w:sz w:val="16"/>
+      <w:szCs w:val="16"/>
+    </w:rPr>
+  </w:style>
+  <w:style w:type="paragraph" w:styleId="CommentText">
+    <w:name w:val="annotation text"/>
+    <w:basedOn w:val="Normal"/>
+    <w:link w:val="CommentTextChar"/>
+    <w:uiPriority w:val="99"/>
+    <w:unhideWhenUsed/>
+    <w:rsid w:val="00AA3A9B"/>
+    <w:rPr>
+      <w:sz w:val="20"/>
+      <w:szCs w:val="20"/>
+    </w:rPr>
+  </w:style>
+  <w:style w:type="character" w:customStyle="1" w:styleId="CommentTextChar">
+    <w:name w:val="Comment Text Char"/>
+    <w:basedOn w:val="DefaultParagraphFont"/>
+    <w:link w:val="CommentText"/>
+    <w:uiPriority w:val="99"/>
+    <w:rsid w:val="00AA3A9B"/>
+    <w:rPr>
+      <w:sz w:val="20"/>
+      <w:szCs w:val="20"/>
+    </w:rPr>
+  </w:style>
+  <w:style w:type="paragraph" w:styleId="CommentSubject">
+    <w:name w:val="annotation subject"/>
+    <w:basedOn w:val="CommentText"/>
+    <w:next w:val="CommentText"/>
+    <w:link w:val="CommentSubjectChar"/>
+    <w:uiPriority w:val="99"/>
+    <w:semiHidden/>
+    <w:unhideWhenUsed/>
+    <w:rsid w:val="00AA3A9B"/>
+    <w:rPr>
+      <w:b/>
+      <w:bCs/>
+    </w:rPr>
+  </w:style>
+  <w:style w:type="character" w:customStyle="1" w:styleId="CommentSubjectChar">
+    <w:name w:val="Comment Subject Char"/>
+    <w:basedOn w:val="CommentTextChar"/>
+    <w:link w:val="CommentSubject"/>
+    <w:uiPriority w:val="99"/>
+    <w:semiHidden/>
+    <w:rsid w:val="00AA3A9B"/>
+    <w:rPr>
+      <w:b/>
+      <w:bCs/>
+      <w:sz w:val="20"/>
+      <w:szCs w:val="20"/>
+    </w:rPr>
   </w:style>
 </w:styles>
 </file>

</xml_diff>